<commit_message>
fix: audit complet — robustesse, UX et améliorations techniques
</commit_message>
<xml_diff>
--- a/AppCook_Bible_Projet.docx
+++ b/AppCook_Bible_Projet.docx
@@ -5416,13 +5416,7 @@
               <w:rPr>
                 <w:rFonts w:eastAsia="Arial" w:cs="Arial"/>
               </w:rPr>
-              <w:t xml:space="preserve">🍳 </w:t>
-            </w:r>
-            <w:r>
-              <w:rPr>
-                <w:rFonts w:eastAsia="Arial" w:cs="Arial"/>
-              </w:rPr>
-              <w:t>Recettes</w:t>
+              <w:t>🍳 Recettes</w:t>
             </w:r>
           </w:p>
         </w:tc>
@@ -5521,13 +5515,7 @@
               <w:rPr>
                 <w:rFonts w:eastAsia="Arial" w:cs="Arial"/>
               </w:rPr>
-              <w:t xml:space="preserve">🛒 </w:t>
-            </w:r>
-            <w:r>
-              <w:rPr>
-                <w:rFonts w:eastAsia="Arial" w:cs="Arial"/>
-              </w:rPr>
-              <w:t>Courses</w:t>
+              <w:t>🛒 Courses</w:t>
             </w:r>
           </w:p>
         </w:tc>
@@ -5626,13 +5614,7 @@
               <w:rPr>
                 <w:rFonts w:eastAsia="Arial" w:cs="Arial"/>
               </w:rPr>
-              <w:t xml:space="preserve">⚙️ </w:t>
-            </w:r>
-            <w:r>
-              <w:rPr>
-                <w:rFonts w:eastAsia="Arial" w:cs="Arial"/>
-              </w:rPr>
-              <w:t>Admin</w:t>
+              <w:t>⚙️ Admin</w:t>
             </w:r>
           </w:p>
         </w:tc>
@@ -7586,15 +7568,7 @@
           <w:b/>
           <w:bCs/>
         </w:rPr>
-        <w:t xml:space="preserve">☐ </w:t>
-      </w:r>
-      <w:r>
-        <w:rPr>
-          <w:rFonts w:eastAsia="Arial" w:cs="Arial"/>
-          <w:b/>
-          <w:bCs/>
-        </w:rPr>
-        <w:t>unchecked</w:t>
+        <w:t>☐ unchecked</w:t>
       </w:r>
       <w:r>
         <w:rPr>
@@ -13103,13 +13077,7 @@
               <w:rPr>
                 <w:rFonts w:eastAsia="Arial" w:cs="Arial"/>
               </w:rPr>
-              <w:t xml:space="preserve">✅ </w:t>
-            </w:r>
-            <w:r>
-              <w:rPr>
-                <w:rFonts w:eastAsia="Arial" w:cs="Arial"/>
-              </w:rPr>
-              <w:t>Livré</w:t>
+              <w:t>✅ Livré</w:t>
             </w:r>
           </w:p>
         </w:tc>
@@ -13203,13 +13171,7 @@
               <w:rPr>
                 <w:rFonts w:eastAsia="Arial" w:cs="Arial"/>
               </w:rPr>
-              <w:t xml:space="preserve">✅ </w:t>
-            </w:r>
-            <w:r>
-              <w:rPr>
-                <w:rFonts w:eastAsia="Arial" w:cs="Arial"/>
-              </w:rPr>
-              <w:t>Livré</w:t>
+              <w:t>✅ Livré</w:t>
             </w:r>
           </w:p>
         </w:tc>
@@ -13303,13 +13265,7 @@
               <w:rPr>
                 <w:rFonts w:eastAsia="Arial" w:cs="Arial"/>
               </w:rPr>
-              <w:t xml:space="preserve">✅ </w:t>
-            </w:r>
-            <w:r>
-              <w:rPr>
-                <w:rFonts w:eastAsia="Arial" w:cs="Arial"/>
-              </w:rPr>
-              <w:t>Livré</w:t>
+              <w:t>✅ Livré</w:t>
             </w:r>
           </w:p>
         </w:tc>
@@ -13403,13 +13359,7 @@
               <w:rPr>
                 <w:rFonts w:eastAsia="Arial" w:cs="Arial"/>
               </w:rPr>
-              <w:t xml:space="preserve">✅ </w:t>
-            </w:r>
-            <w:r>
-              <w:rPr>
-                <w:rFonts w:eastAsia="Arial" w:cs="Arial"/>
-              </w:rPr>
-              <w:t>Livré</w:t>
+              <w:t>✅ Livré</w:t>
             </w:r>
           </w:p>
         </w:tc>
@@ -13508,13 +13458,7 @@
               <w:rPr>
                 <w:rFonts w:eastAsia="Arial" w:cs="Arial"/>
               </w:rPr>
-              <w:t xml:space="preserve">✅ </w:t>
-            </w:r>
-            <w:r>
-              <w:rPr>
-                <w:rFonts w:eastAsia="Arial" w:cs="Arial"/>
-              </w:rPr>
-              <w:t>Livré</w:t>
+              <w:t>✅ Livré</w:t>
             </w:r>
           </w:p>
         </w:tc>
@@ -13613,13 +13557,7 @@
               <w:rPr>
                 <w:rFonts w:eastAsia="Arial" w:cs="Arial"/>
               </w:rPr>
-              <w:t xml:space="preserve">✅ </w:t>
-            </w:r>
-            <w:r>
-              <w:rPr>
-                <w:rFonts w:eastAsia="Arial" w:cs="Arial"/>
-              </w:rPr>
-              <w:t>Livré</w:t>
+              <w:t>✅ Livré</w:t>
             </w:r>
           </w:p>
         </w:tc>
@@ -13718,13 +13656,7 @@
               <w:rPr>
                 <w:rFonts w:eastAsia="Arial" w:cs="Arial"/>
               </w:rPr>
-              <w:t xml:space="preserve">✅ </w:t>
-            </w:r>
-            <w:r>
-              <w:rPr>
-                <w:rFonts w:eastAsia="Arial" w:cs="Arial"/>
-              </w:rPr>
-              <w:t>Livré</w:t>
+              <w:t>✅ Livré</w:t>
             </w:r>
           </w:p>
         </w:tc>
@@ -13995,13 +13927,7 @@
               <w:rPr>
                 <w:rFonts w:eastAsia="Arial" w:cs="Arial"/>
               </w:rPr>
-              <w:t xml:space="preserve">✅ </w:t>
-            </w:r>
-            <w:r>
-              <w:rPr>
-                <w:rFonts w:eastAsia="Arial" w:cs="Arial"/>
-              </w:rPr>
-              <w:t>Livré</w:t>
+              <w:t>✅ Livré</w:t>
             </w:r>
           </w:p>
         </w:tc>
@@ -14095,13 +14021,7 @@
               <w:rPr>
                 <w:rFonts w:eastAsia="Arial" w:cs="Arial"/>
               </w:rPr>
-              <w:t xml:space="preserve">✅ </w:t>
-            </w:r>
-            <w:r>
-              <w:rPr>
-                <w:rFonts w:eastAsia="Arial" w:cs="Arial"/>
-              </w:rPr>
-              <w:t>Livré</w:t>
+              <w:t>✅ Livré</w:t>
             </w:r>
           </w:p>
         </w:tc>
@@ -14200,13 +14120,7 @@
               <w:rPr>
                 <w:rFonts w:eastAsia="Arial" w:cs="Arial"/>
               </w:rPr>
-              <w:t xml:space="preserve">✅ </w:t>
-            </w:r>
-            <w:r>
-              <w:rPr>
-                <w:rFonts w:eastAsia="Arial" w:cs="Arial"/>
-              </w:rPr>
-              <w:t>Livré</w:t>
+              <w:t>✅ Livré</w:t>
             </w:r>
           </w:p>
         </w:tc>
@@ -14305,13 +14219,7 @@
               <w:rPr>
                 <w:rFonts w:eastAsia="Arial" w:cs="Arial"/>
               </w:rPr>
-              <w:t xml:space="preserve">✅ </w:t>
-            </w:r>
-            <w:r>
-              <w:rPr>
-                <w:rFonts w:eastAsia="Arial" w:cs="Arial"/>
-              </w:rPr>
-              <w:t>Livré</w:t>
+              <w:t>✅ Livré</w:t>
             </w:r>
           </w:p>
         </w:tc>
@@ -14410,13 +14318,7 @@
               <w:rPr>
                 <w:rFonts w:eastAsia="Arial" w:cs="Arial"/>
               </w:rPr>
-              <w:t xml:space="preserve">✅ </w:t>
-            </w:r>
-            <w:r>
-              <w:rPr>
-                <w:rFonts w:eastAsia="Arial" w:cs="Arial"/>
-              </w:rPr>
-              <w:t>Livré</w:t>
+              <w:t>✅ Livré</w:t>
             </w:r>
           </w:p>
         </w:tc>
@@ -14515,13 +14417,7 @@
               <w:rPr>
                 <w:rFonts w:eastAsia="Arial" w:cs="Arial"/>
               </w:rPr>
-              <w:t xml:space="preserve">✅ </w:t>
-            </w:r>
-            <w:r>
-              <w:rPr>
-                <w:rFonts w:eastAsia="Arial" w:cs="Arial"/>
-              </w:rPr>
-              <w:t>Livré</w:t>
+              <w:t>✅ Livré</w:t>
             </w:r>
           </w:p>
         </w:tc>
@@ -14620,13 +14516,7 @@
               <w:rPr>
                 <w:rFonts w:eastAsia="Arial" w:cs="Arial"/>
               </w:rPr>
-              <w:t xml:space="preserve">✅ </w:t>
-            </w:r>
-            <w:r>
-              <w:rPr>
-                <w:rFonts w:eastAsia="Arial" w:cs="Arial"/>
-              </w:rPr>
-              <w:t>Livré</w:t>
+              <w:t>✅ Livré</w:t>
             </w:r>
           </w:p>
         </w:tc>
@@ -14725,13 +14615,7 @@
               <w:rPr>
                 <w:rFonts w:eastAsia="Arial" w:cs="Arial"/>
               </w:rPr>
-              <w:t xml:space="preserve">✅ </w:t>
-            </w:r>
-            <w:r>
-              <w:rPr>
-                <w:rFonts w:eastAsia="Arial" w:cs="Arial"/>
-              </w:rPr>
-              <w:t>Livré</w:t>
+              <w:t>✅ Livré</w:t>
             </w:r>
           </w:p>
         </w:tc>
@@ -14830,13 +14714,7 @@
               <w:rPr>
                 <w:rFonts w:eastAsia="Arial" w:cs="Arial"/>
               </w:rPr>
-              <w:t xml:space="preserve">✅ </w:t>
-            </w:r>
-            <w:r>
-              <w:rPr>
-                <w:rFonts w:eastAsia="Arial" w:cs="Arial"/>
-              </w:rPr>
-              <w:t>Livré</w:t>
+              <w:t>✅ Livré</w:t>
             </w:r>
           </w:p>
         </w:tc>
@@ -14935,13 +14813,7 @@
               <w:rPr>
                 <w:rFonts w:eastAsia="Arial" w:cs="Arial"/>
               </w:rPr>
-              <w:t xml:space="preserve">✅ </w:t>
-            </w:r>
-            <w:r>
-              <w:rPr>
-                <w:rFonts w:eastAsia="Arial" w:cs="Arial"/>
-              </w:rPr>
-              <w:t>Livré</w:t>
+              <w:t>✅ Livré</w:t>
             </w:r>
           </w:p>
         </w:tc>
@@ -15040,13 +14912,7 @@
               <w:rPr>
                 <w:rFonts w:eastAsia="Arial" w:cs="Arial"/>
               </w:rPr>
-              <w:t xml:space="preserve">✅ </w:t>
-            </w:r>
-            <w:r>
-              <w:rPr>
-                <w:rFonts w:eastAsia="Arial" w:cs="Arial"/>
-              </w:rPr>
-              <w:t>Livré</w:t>
+              <w:t>✅ Livré</w:t>
             </w:r>
           </w:p>
         </w:tc>
@@ -15310,13 +15176,7 @@
               <w:rPr>
                 <w:rFonts w:eastAsia="Arial" w:cs="Arial"/>
               </w:rPr>
-              <w:t xml:space="preserve">✅ </w:t>
-            </w:r>
-            <w:r>
-              <w:rPr>
-                <w:rFonts w:eastAsia="Arial" w:cs="Arial"/>
-              </w:rPr>
-              <w:t>Livré</w:t>
+              <w:t>✅ Livré</w:t>
             </w:r>
           </w:p>
         </w:tc>
@@ -15415,13 +15275,7 @@
               <w:rPr>
                 <w:rFonts w:eastAsia="Arial" w:cs="Arial"/>
               </w:rPr>
-              <w:t xml:space="preserve">✅ </w:t>
-            </w:r>
-            <w:r>
-              <w:rPr>
-                <w:rFonts w:eastAsia="Arial" w:cs="Arial"/>
-              </w:rPr>
-              <w:t>Livré</w:t>
+              <w:t>✅ Livré</w:t>
             </w:r>
           </w:p>
         </w:tc>
@@ -15520,13 +15374,7 @@
               <w:rPr>
                 <w:rFonts w:eastAsia="Arial" w:cs="Arial"/>
               </w:rPr>
-              <w:t xml:space="preserve">✅ </w:t>
-            </w:r>
-            <w:r>
-              <w:rPr>
-                <w:rFonts w:eastAsia="Arial" w:cs="Arial"/>
-              </w:rPr>
-              <w:t>Livré</w:t>
+              <w:t>✅ Livré</w:t>
             </w:r>
           </w:p>
         </w:tc>
@@ -15625,13 +15473,7 @@
               <w:rPr>
                 <w:rFonts w:eastAsia="Arial" w:cs="Arial"/>
               </w:rPr>
-              <w:t xml:space="preserve">✅ </w:t>
-            </w:r>
-            <w:r>
-              <w:rPr>
-                <w:rFonts w:eastAsia="Arial" w:cs="Arial"/>
-              </w:rPr>
-              <w:t>Livré</w:t>
+              <w:t>✅ Livré</w:t>
             </w:r>
           </w:p>
         </w:tc>
@@ -15725,13 +15567,7 @@
               <w:rPr>
                 <w:rFonts w:eastAsia="Arial" w:cs="Arial"/>
               </w:rPr>
-              <w:t xml:space="preserve">✅ </w:t>
-            </w:r>
-            <w:r>
-              <w:rPr>
-                <w:rFonts w:eastAsia="Arial" w:cs="Arial"/>
-              </w:rPr>
-              <w:t>Livré</w:t>
+              <w:t>✅ Livré</w:t>
             </w:r>
           </w:p>
         </w:tc>
@@ -15825,13 +15661,7 @@
               <w:rPr>
                 <w:rFonts w:eastAsia="Arial" w:cs="Arial"/>
               </w:rPr>
-              <w:t xml:space="preserve">✅ </w:t>
-            </w:r>
-            <w:r>
-              <w:rPr>
-                <w:rFonts w:eastAsia="Arial" w:cs="Arial"/>
-              </w:rPr>
-              <w:t>Livré</w:t>
+              <w:t>✅ Livré</w:t>
             </w:r>
           </w:p>
         </w:tc>
@@ -15930,13 +15760,7 @@
               <w:rPr>
                 <w:rFonts w:eastAsia="Arial" w:cs="Arial"/>
               </w:rPr>
-              <w:t xml:space="preserve">✅ </w:t>
-            </w:r>
-            <w:r>
-              <w:rPr>
-                <w:rFonts w:eastAsia="Arial" w:cs="Arial"/>
-              </w:rPr>
-              <w:t>Livré</w:t>
+              <w:t>✅ Livré</w:t>
             </w:r>
           </w:p>
         </w:tc>
@@ -16035,13 +15859,7 @@
               <w:rPr>
                 <w:rFonts w:eastAsia="Arial" w:cs="Arial"/>
               </w:rPr>
-              <w:t xml:space="preserve">✅ </w:t>
-            </w:r>
-            <w:r>
-              <w:rPr>
-                <w:rFonts w:eastAsia="Arial" w:cs="Arial"/>
-              </w:rPr>
-              <w:t>Livré</w:t>
+              <w:t>✅ Livré</w:t>
             </w:r>
           </w:p>
         </w:tc>
@@ -16140,13 +15958,7 @@
               <w:rPr>
                 <w:rFonts w:eastAsia="Arial" w:cs="Arial"/>
               </w:rPr>
-              <w:t xml:space="preserve">✅ </w:t>
-            </w:r>
-            <w:r>
-              <w:rPr>
-                <w:rFonts w:eastAsia="Arial" w:cs="Arial"/>
-              </w:rPr>
-              <w:t>Livré</w:t>
+              <w:t>✅ Livré</w:t>
             </w:r>
           </w:p>
         </w:tc>
@@ -16245,13 +16057,7 @@
               <w:rPr>
                 <w:rFonts w:eastAsia="Arial" w:cs="Arial"/>
               </w:rPr>
-              <w:t xml:space="preserve">✅ </w:t>
-            </w:r>
-            <w:r>
-              <w:rPr>
-                <w:rFonts w:eastAsia="Arial" w:cs="Arial"/>
-              </w:rPr>
-              <w:t>Livré</w:t>
+              <w:t>✅ Livré</w:t>
             </w:r>
           </w:p>
         </w:tc>
@@ -16350,13 +16156,7 @@
               <w:rPr>
                 <w:rFonts w:eastAsia="Arial" w:cs="Arial"/>
               </w:rPr>
-              <w:t xml:space="preserve">✅ </w:t>
-            </w:r>
-            <w:r>
-              <w:rPr>
-                <w:rFonts w:eastAsia="Arial" w:cs="Arial"/>
-              </w:rPr>
-              <w:t>Livré</w:t>
+              <w:t>✅ Livré</w:t>
             </w:r>
           </w:p>
         </w:tc>
@@ -16455,13 +16255,7 @@
               <w:rPr>
                 <w:rFonts w:eastAsia="Arial" w:cs="Arial"/>
               </w:rPr>
-              <w:t xml:space="preserve">✅ </w:t>
-            </w:r>
-            <w:r>
-              <w:rPr>
-                <w:rFonts w:eastAsia="Arial" w:cs="Arial"/>
-              </w:rPr>
-              <w:t>Livré</w:t>
+              <w:t>✅ Livré</w:t>
             </w:r>
           </w:p>
         </w:tc>
@@ -16560,13 +16354,7 @@
               <w:rPr>
                 <w:rFonts w:eastAsia="Arial" w:cs="Arial"/>
               </w:rPr>
-              <w:t xml:space="preserve">✅ </w:t>
-            </w:r>
-            <w:r>
-              <w:rPr>
-                <w:rFonts w:eastAsia="Arial" w:cs="Arial"/>
-              </w:rPr>
-              <w:t>Livré</w:t>
+              <w:t>✅ Livré</w:t>
             </w:r>
           </w:p>
         </w:tc>
@@ -16665,13 +16453,7 @@
               <w:rPr>
                 <w:rFonts w:eastAsia="Arial" w:cs="Arial"/>
               </w:rPr>
-              <w:t xml:space="preserve">✅ </w:t>
-            </w:r>
-            <w:r>
-              <w:rPr>
-                <w:rFonts w:eastAsia="Arial" w:cs="Arial"/>
-              </w:rPr>
-              <w:t>Livré</w:t>
+              <w:t>✅ Livré</w:t>
             </w:r>
           </w:p>
         </w:tc>
@@ -16765,13 +16547,7 @@
               <w:rPr>
                 <w:rFonts w:eastAsia="Arial" w:cs="Arial"/>
               </w:rPr>
-              <w:t xml:space="preserve">✅ </w:t>
-            </w:r>
-            <w:r>
-              <w:rPr>
-                <w:rFonts w:eastAsia="Arial" w:cs="Arial"/>
-              </w:rPr>
-              <w:t>Livré</w:t>
+              <w:t>✅ Livré</w:t>
             </w:r>
           </w:p>
         </w:tc>
@@ -17042,13 +16818,7 @@
               <w:rPr>
                 <w:rFonts w:eastAsia="Arial" w:cs="Arial"/>
               </w:rPr>
-              <w:t xml:space="preserve">✅ </w:t>
-            </w:r>
-            <w:r>
-              <w:rPr>
-                <w:rFonts w:eastAsia="Arial" w:cs="Arial"/>
-              </w:rPr>
-              <w:t>Livré</w:t>
+              <w:t>✅ Livré</w:t>
             </w:r>
           </w:p>
         </w:tc>
@@ -17147,13 +16917,7 @@
               <w:rPr>
                 <w:rFonts w:eastAsia="Arial" w:cs="Arial"/>
               </w:rPr>
-              <w:t xml:space="preserve">✅ </w:t>
-            </w:r>
-            <w:r>
-              <w:rPr>
-                <w:rFonts w:eastAsia="Arial" w:cs="Arial"/>
-              </w:rPr>
-              <w:t>Livré</w:t>
+              <w:t>✅ Livré</w:t>
             </w:r>
           </w:p>
         </w:tc>
@@ -17252,13 +17016,7 @@
               <w:rPr>
                 <w:rFonts w:eastAsia="Arial" w:cs="Arial"/>
               </w:rPr>
-              <w:t xml:space="preserve">✅ </w:t>
-            </w:r>
-            <w:r>
-              <w:rPr>
-                <w:rFonts w:eastAsia="Arial" w:cs="Arial"/>
-              </w:rPr>
-              <w:t>Livré</w:t>
+              <w:t>✅ Livré</w:t>
             </w:r>
           </w:p>
         </w:tc>
@@ -17357,13 +17115,7 @@
               <w:rPr>
                 <w:rFonts w:eastAsia="Arial" w:cs="Arial"/>
               </w:rPr>
-              <w:t xml:space="preserve">✅ </w:t>
-            </w:r>
-            <w:r>
-              <w:rPr>
-                <w:rFonts w:eastAsia="Arial" w:cs="Arial"/>
-              </w:rPr>
-              <w:t>Livré</w:t>
+              <w:t>✅ Livré</w:t>
             </w:r>
           </w:p>
         </w:tc>
@@ -17462,13 +17214,7 @@
               <w:rPr>
                 <w:rFonts w:eastAsia="Arial" w:cs="Arial"/>
               </w:rPr>
-              <w:t xml:space="preserve">✅ </w:t>
-            </w:r>
-            <w:r>
-              <w:rPr>
-                <w:rFonts w:eastAsia="Arial" w:cs="Arial"/>
-              </w:rPr>
-              <w:t>Livré</w:t>
+              <w:t>✅ Livré</w:t>
             </w:r>
           </w:p>
         </w:tc>
@@ -17565,13 +17311,7 @@
               <w:rPr>
                 <w:rFonts w:eastAsia="Arial" w:cs="Arial"/>
               </w:rPr>
-              <w:t xml:space="preserve">✅ </w:t>
-            </w:r>
-            <w:r>
-              <w:rPr>
-                <w:rFonts w:eastAsia="Arial" w:cs="Arial"/>
-              </w:rPr>
-              <w:t>Livré</w:t>
+              <w:t>✅ Livré</w:t>
             </w:r>
           </w:p>
         </w:tc>
@@ -17665,13 +17405,7 @@
               <w:rPr>
                 <w:rFonts w:eastAsia="Arial" w:cs="Arial"/>
               </w:rPr>
-              <w:t xml:space="preserve">✅ </w:t>
-            </w:r>
-            <w:r>
-              <w:rPr>
-                <w:rFonts w:eastAsia="Arial" w:cs="Arial"/>
-              </w:rPr>
-              <w:t>Livré</w:t>
+              <w:t>✅ Livré</w:t>
             </w:r>
           </w:p>
         </w:tc>
@@ -17770,13 +17504,7 @@
               <w:rPr>
                 <w:rFonts w:eastAsia="Arial" w:cs="Arial"/>
               </w:rPr>
-              <w:t xml:space="preserve">✅ </w:t>
-            </w:r>
-            <w:r>
-              <w:rPr>
-                <w:rFonts w:eastAsia="Arial" w:cs="Arial"/>
-              </w:rPr>
-              <w:t>Livré</w:t>
+              <w:t>✅ Livré</w:t>
             </w:r>
           </w:p>
         </w:tc>
@@ -18052,13 +17780,7 @@
               <w:rPr>
                 <w:rFonts w:eastAsia="Arial" w:cs="Arial"/>
               </w:rPr>
-              <w:t xml:space="preserve">✅ </w:t>
-            </w:r>
-            <w:r>
-              <w:rPr>
-                <w:rFonts w:eastAsia="Arial" w:cs="Arial"/>
-              </w:rPr>
-              <w:t>Livré</w:t>
+              <w:t>✅ Livré</w:t>
             </w:r>
           </w:p>
         </w:tc>
@@ -18157,13 +17879,7 @@
               <w:rPr>
                 <w:rFonts w:eastAsia="Arial" w:cs="Arial"/>
               </w:rPr>
-              <w:t xml:space="preserve">✅ </w:t>
-            </w:r>
-            <w:r>
-              <w:rPr>
-                <w:rFonts w:eastAsia="Arial" w:cs="Arial"/>
-              </w:rPr>
-              <w:t>Livré</w:t>
+              <w:t>✅ Livré</w:t>
             </w:r>
           </w:p>
         </w:tc>
@@ -18257,13 +17973,7 @@
               <w:rPr>
                 <w:rFonts w:eastAsia="Arial" w:cs="Arial"/>
               </w:rPr>
-              <w:t xml:space="preserve">✅ </w:t>
-            </w:r>
-            <w:r>
-              <w:rPr>
-                <w:rFonts w:eastAsia="Arial" w:cs="Arial"/>
-              </w:rPr>
-              <w:t>Livré</w:t>
+              <w:t>✅ Livré</w:t>
             </w:r>
           </w:p>
         </w:tc>
@@ -18357,13 +18067,7 @@
               <w:rPr>
                 <w:rFonts w:eastAsia="Arial" w:cs="Arial"/>
               </w:rPr>
-              <w:t xml:space="preserve">✅ </w:t>
-            </w:r>
-            <w:r>
-              <w:rPr>
-                <w:rFonts w:eastAsia="Arial" w:cs="Arial"/>
-              </w:rPr>
-              <w:t>Livré</w:t>
+              <w:t>✅ Livré</w:t>
             </w:r>
           </w:p>
         </w:tc>
@@ -18457,13 +18161,7 @@
               <w:rPr>
                 <w:rFonts w:eastAsia="Arial" w:cs="Arial"/>
               </w:rPr>
-              <w:t xml:space="preserve">✅ </w:t>
-            </w:r>
-            <w:r>
-              <w:rPr>
-                <w:rFonts w:eastAsia="Arial" w:cs="Arial"/>
-              </w:rPr>
-              <w:t>Livré</w:t>
+              <w:t>✅ Livré</w:t>
             </w:r>
           </w:p>
         </w:tc>
@@ -18530,17 +18228,6 @@
           <w:sz w:val="28"/>
           <w:szCs w:val="28"/>
         </w:rPr>
-        <w:t>1</w:t>
-      </w:r>
-      <w:r>
-        <w:rPr>
-          <w:rFonts w:eastAsia="Arial" w:cs="Arial" w:ascii="Arial" w:hAnsi="Arial"/>
-          <w:b/>
-          <w:bCs/>
-          <w:color w:val="1F2937"/>
-          <w:sz w:val="28"/>
-          <w:szCs w:val="28"/>
-        </w:rPr>
         <w:t>5.2 Ce qui reste à faire — Backlog priorisé</w:t>
       </w:r>
     </w:p>
@@ -18568,18 +18255,7 @@
           <w:sz w:val="24"/>
           <w:szCs w:val="24"/>
         </w:rPr>
-        <w:t xml:space="preserve">🔴 </w:t>
-      </w:r>
-      <w:r>
-        <w:rPr>
-          <w:rFonts w:eastAsia="Arial" w:cs="Arial" w:ascii="Arial" w:hAnsi="Arial"/>
-          <w:b/>
-          <w:bCs/>
-          <w:color w:val="374151"/>
-          <w:sz w:val="24"/>
-          <w:szCs w:val="24"/>
-        </w:rPr>
-        <w:t>PRIORITÉ HAUTE — Fonctionnalités bloquantes</w:t>
+        <w:t>🔴 PRIORITÉ HAUTE — Fonctionnalités bloquantes</w:t>
       </w:r>
     </w:p>
     <w:tbl>
@@ -18749,7 +18425,7 @@
               <w:rPr>
                 <w:rFonts w:eastAsia="Arial" w:cs="Arial"/>
               </w:rPr>
-              <w:t>Admin : formulaire ingrédients (étape 2)</w:t>
+              <w:t>✅ Admin : formulaire ingrédients (étape 2)</w:t>
             </w:r>
           </w:p>
         </w:tc>
@@ -18848,7 +18524,7 @@
               <w:rPr>
                 <w:rFonts w:eastAsia="Arial" w:cs="Arial"/>
               </w:rPr>
-              <w:t>Admin : formulaire étapes (étape 3)</w:t>
+              <w:t>✅ Admin : formulaire étapes (étape 3)</w:t>
             </w:r>
           </w:p>
         </w:tc>
@@ -18947,7 +18623,7 @@
               <w:rPr>
                 <w:rFonts w:eastAsia="Arial" w:cs="Arial"/>
               </w:rPr>
-              <w:t>Admin : sauvegarde finale création/édition recette</w:t>
+              <w:t>✅ Admin : sauvegarde finale création/édition recette</w:t>
             </w:r>
           </w:p>
         </w:tc>
@@ -19046,7 +18722,7 @@
               <w:rPr>
                 <w:rFonts w:eastAsia="Arial" w:cs="Arial"/>
               </w:rPr>
-              <w:t>Admin Catalogue : édition inline unité par défaut</w:t>
+              <w:t>✅ Admin Catalogue : édition inline unité par défaut</w:t>
             </w:r>
           </w:p>
         </w:tc>
@@ -19145,7 +18821,7 @@
               <w:rPr>
                 <w:rFonts w:eastAsia="Arial" w:cs="Arial"/>
               </w:rPr>
-              <w:t>Admin Catalogue : interface fusion doublons</w:t>
+              <w:t>✅ Admin Catalogue : interface fusion doublons</w:t>
             </w:r>
           </w:p>
         </w:tc>
@@ -19244,18 +18920,7 @@
           <w:sz w:val="24"/>
           <w:szCs w:val="24"/>
         </w:rPr>
-        <w:t xml:space="preserve">🟡 </w:t>
-      </w:r>
-      <w:r>
-        <w:rPr>
-          <w:rFonts w:eastAsia="Arial" w:cs="Arial" w:ascii="Arial" w:hAnsi="Arial"/>
-          <w:b/>
-          <w:bCs/>
-          <w:color w:val="374151"/>
-          <w:sz w:val="24"/>
-          <w:szCs w:val="24"/>
-        </w:rPr>
-        <w:t>PRIORITÉ MOYENNE — Amélioration expérience</w:t>
+        <w:t>🟡 PRIORITÉ MOYENNE — Amélioration expérience</w:t>
       </w:r>
     </w:p>
     <w:tbl>
@@ -19425,7 +19090,7 @@
               <w:rPr>
                 <w:rFonts w:eastAsia="Arial" w:cs="Arial"/>
               </w:rPr>
-              <w:t>Ancrage temporel dans RecipeDetail</w:t>
+              <w:t>✅ Ancrage temporel dans RecipeDetail</w:t>
             </w:r>
           </w:p>
         </w:tc>
@@ -19524,7 +19189,7 @@
               <w:rPr>
                 <w:rFonts w:eastAsia="Arial" w:cs="Arial"/>
               </w:rPr>
-              <w:t>Recherche texte dans la liste des recettes</w:t>
+              <w:t>✅ Recherche texte dans la liste des recettes</w:t>
             </w:r>
           </w:p>
         </w:tc>
@@ -19623,7 +19288,7 @@
               <w:rPr>
                 <w:rFonts w:eastAsia="Arial" w:cs="Arial"/>
               </w:rPr>
-              <w:t>Catégorie des ingrédients dans le catalogue</w:t>
+              <w:t>✅ Catégorie des ingrédients dans le catalogue</w:t>
             </w:r>
           </w:p>
         </w:tc>
@@ -19722,7 +19387,7 @@
               <w:rPr>
                 <w:rFonts w:eastAsia="Arial" w:cs="Arial"/>
               </w:rPr>
-              <w:t>Suppression recette avec confirmation</w:t>
+              <w:t>✅ Suppression recette avec confirmation</w:t>
             </w:r>
           </w:p>
         </w:tc>
@@ -19821,7 +19486,7 @@
               <w:rPr>
                 <w:rFonts w:eastAsia="Arial" w:cs="Arial"/>
               </w:rPr>
-              <w:t>Gestion des erreurs de génération de liste</w:t>
+              <w:t>✅ Gestion des erreurs de génération de liste</w:t>
             </w:r>
           </w:p>
         </w:tc>
@@ -20019,7 +19684,7 @@
               <w:rPr>
                 <w:rFonts w:eastAsia="Arial" w:cs="Arial"/>
               </w:rPr>
-              <w:t>Export sélectif (1 recette à la fois depuis le détail)</w:t>
+              <w:t>✅ Export sélectif (1 recette à la fois depuis le détail)</w:t>
             </w:r>
           </w:p>
         </w:tc>
@@ -20125,18 +19790,7 @@
           <w:sz w:val="24"/>
           <w:szCs w:val="24"/>
         </w:rPr>
-        <w:t xml:space="preserve">🟢 </w:t>
-      </w:r>
-      <w:r>
-        <w:rPr>
-          <w:rFonts w:eastAsia="Arial" w:cs="Arial" w:ascii="Arial" w:hAnsi="Arial"/>
-          <w:b/>
-          <w:bCs/>
-          <w:color w:val="374151"/>
-          <w:sz w:val="24"/>
-          <w:szCs w:val="24"/>
-        </w:rPr>
-        <w:t>PRIORITÉ BASSE — Vision future</w:t>
+        <w:t>🟢 PRIORITÉ BASSE — Vision future</w:t>
       </w:r>
     </w:p>
     <w:tbl>
@@ -20405,7 +20059,7 @@
               <w:rPr>
                 <w:rFonts w:eastAsia="Arial" w:cs="Arial"/>
               </w:rPr>
-              <w:t>Icônes PWA (192px + 512px)</w:t>
+              <w:t>✅ Icônes PWA (192px + 512px)</w:t>
             </w:r>
           </w:p>
         </w:tc>
@@ -21458,6 +21112,3090 @@
                 <w:rFonts w:eastAsia="Arial" w:cs="Arial"/>
               </w:rPr>
               <w:t>Suggestions de recettes basées sur les ingrédients disponibles, adaptation auto des portions</w:t>
+            </w:r>
+          </w:p>
+        </w:tc>
+      </w:tr>
+    </w:tbl>
+    <w:p>
+      <w:pPr>
+        <w:pStyle w:val="Normal"/>
+        <w:bidi w:val="0"/>
+        <w:spacing w:before="200" w:after="0"/>
+        <w:jc w:val="start"/>
+        <w:rPr/>
+      </w:pPr>
+      <w:r>
+        <w:rPr/>
+      </w:r>
+    </w:p>
+    <w:p>
+      <w:pPr>
+        <w:pStyle w:val="Heading3"/>
+        <w:bidi w:val="0"/>
+        <w:spacing w:before="280" w:after="100"/>
+        <w:jc w:val="start"/>
+        <w:rPr>
+          <w:rFonts w:ascii="Arial" w:hAnsi="Arial" w:eastAsia="Arial" w:cs="Arial"/>
+          <w:b/>
+          <w:bCs/>
+          <w:color w:val="374151"/>
+          <w:sz w:val="24"/>
+          <w:szCs w:val="24"/>
+        </w:rPr>
+      </w:pPr>
+      <w:r>
+        <w:rPr>
+          <w:rFonts w:eastAsia="Arial" w:cs="Arial" w:ascii="Arial" w:hAnsi="Arial"/>
+          <w:b/>
+          <w:bCs/>
+          <w:color w:val="374151"/>
+          <w:sz w:val="24"/>
+          <w:szCs w:val="24"/>
+        </w:rPr>
+        <w:t>🆕 Livré en mai 2026 — Sprint récent</w:t>
+      </w:r>
+    </w:p>
+    <w:tbl>
+      <w:tblPr>
+        <w:tblW w:w="9360" w:type="dxa"/>
+        <w:jc w:val="start"/>
+        <w:tblInd w:w="0" w:type="dxa"/>
+        <w:tblLayout w:type="fixed"/>
+        <w:tblCellMar>
+          <w:top w:w="80" w:type="dxa"/>
+          <w:start w:w="120" w:type="dxa"/>
+          <w:bottom w:w="80" w:type="dxa"/>
+          <w:end w:w="120" w:type="dxa"/>
+        </w:tblCellMar>
+      </w:tblPr>
+      <w:tblGrid>
+        <w:gridCol w:w="4199"/>
+        <w:gridCol w:w="1800"/>
+        <w:gridCol w:w="3361"/>
+      </w:tblGrid>
+      <w:tr>
+        <w:trPr>
+          <w:tblHeader w:val="true"/>
+        </w:trPr>
+        <w:tc>
+          <w:tcPr>
+            <w:tcW w:w="4199" w:type="dxa"/>
+            <w:tcBorders>
+              <w:top w:val="single" w:sz="2" w:space="0" w:color="CCCCCC"/>
+              <w:start w:val="single" w:sz="2" w:space="0" w:color="CCCCCC"/>
+              <w:bottom w:val="single" w:sz="2" w:space="0" w:color="CCCCCC"/>
+              <w:end w:val="single" w:sz="2" w:space="0" w:color="CCCCCC"/>
+            </w:tcBorders>
+            <w:shd w:fill="1F2937" w:val="clear"/>
+          </w:tcPr>
+          <w:p>
+            <w:pPr>
+              <w:pStyle w:val="Normal"/>
+              <w:bidi w:val="0"/>
+              <w:jc w:val="start"/>
+              <w:rPr>
+                <w:rFonts w:ascii="Arial" w:hAnsi="Arial" w:eastAsia="Arial" w:cs="Arial"/>
+                <w:b/>
+                <w:bCs/>
+                <w:color w:val="FFFFFF"/>
+                <w:sz w:val="20"/>
+                <w:szCs w:val="20"/>
+              </w:rPr>
+            </w:pPr>
+            <w:r>
+              <w:rPr>
+                <w:rFonts w:eastAsia="Arial" w:cs="Arial"/>
+                <w:b/>
+                <w:bCs/>
+                <w:color w:val="FFFFFF"/>
+                <w:sz w:val="20"/>
+                <w:szCs w:val="20"/>
+              </w:rPr>
+              <w:t>Fonctionnalité</w:t>
+            </w:r>
+          </w:p>
+        </w:tc>
+        <w:tc>
+          <w:tcPr>
+            <w:tcW w:w="1800" w:type="dxa"/>
+            <w:tcBorders>
+              <w:top w:val="single" w:sz="2" w:space="0" w:color="CCCCCC"/>
+              <w:start w:val="single" w:sz="2" w:space="0" w:color="CCCCCC"/>
+              <w:bottom w:val="single" w:sz="2" w:space="0" w:color="CCCCCC"/>
+              <w:end w:val="single" w:sz="2" w:space="0" w:color="CCCCCC"/>
+            </w:tcBorders>
+            <w:shd w:fill="1F2937" w:val="clear"/>
+          </w:tcPr>
+          <w:p>
+            <w:pPr>
+              <w:pStyle w:val="Normal"/>
+              <w:bidi w:val="0"/>
+              <w:jc w:val="start"/>
+              <w:rPr>
+                <w:rFonts w:ascii="Arial" w:hAnsi="Arial" w:eastAsia="Arial" w:cs="Arial"/>
+                <w:b/>
+                <w:bCs/>
+                <w:color w:val="FFFFFF"/>
+                <w:sz w:val="20"/>
+                <w:szCs w:val="20"/>
+              </w:rPr>
+            </w:pPr>
+            <w:r>
+              <w:rPr>
+                <w:rFonts w:eastAsia="Arial" w:cs="Arial"/>
+                <w:b/>
+                <w:bCs/>
+                <w:color w:val="FFFFFF"/>
+                <w:sz w:val="20"/>
+                <w:szCs w:val="20"/>
+              </w:rPr>
+              <w:t>Effort</w:t>
+            </w:r>
+          </w:p>
+        </w:tc>
+        <w:tc>
+          <w:tcPr>
+            <w:tcW w:w="3361" w:type="dxa"/>
+            <w:tcBorders>
+              <w:top w:val="single" w:sz="2" w:space="0" w:color="CCCCCC"/>
+              <w:start w:val="single" w:sz="2" w:space="0" w:color="CCCCCC"/>
+              <w:bottom w:val="single" w:sz="2" w:space="0" w:color="CCCCCC"/>
+              <w:end w:val="single" w:sz="2" w:space="0" w:color="CCCCCC"/>
+            </w:tcBorders>
+            <w:shd w:fill="1F2937" w:val="clear"/>
+          </w:tcPr>
+          <w:p>
+            <w:pPr>
+              <w:pStyle w:val="Normal"/>
+              <w:bidi w:val="0"/>
+              <w:jc w:val="start"/>
+              <w:rPr>
+                <w:rFonts w:ascii="Arial" w:hAnsi="Arial" w:eastAsia="Arial" w:cs="Arial"/>
+                <w:b/>
+                <w:bCs/>
+                <w:color w:val="FFFFFF"/>
+                <w:sz w:val="20"/>
+                <w:szCs w:val="20"/>
+              </w:rPr>
+            </w:pPr>
+            <w:r>
+              <w:rPr>
+                <w:rFonts w:eastAsia="Arial" w:cs="Arial"/>
+                <w:b/>
+                <w:bCs/>
+                <w:color w:val="FFFFFF"/>
+                <w:sz w:val="20"/>
+                <w:szCs w:val="20"/>
+              </w:rPr>
+              <w:t>Détail</w:t>
+            </w:r>
+          </w:p>
+        </w:tc>
+      </w:tr>
+      <w:tr>
+        <w:trPr/>
+        <w:tc>
+          <w:tcPr>
+            <w:tcW w:w="4199" w:type="dxa"/>
+            <w:tcBorders>
+              <w:top w:val="single" w:sz="2" w:space="0" w:color="CCCCCC"/>
+              <w:start w:val="single" w:sz="2" w:space="0" w:color="CCCCCC"/>
+              <w:bottom w:val="single" w:sz="2" w:space="0" w:color="CCCCCC"/>
+              <w:end w:val="single" w:sz="2" w:space="0" w:color="CCCCCC"/>
+            </w:tcBorders>
+            <w:shd w:fill="D1FAE5" w:val="clear"/>
+            <w:tcMar>
+              <w:top w:w="70" w:type="dxa"/>
+              <w:bottom w:w="70" w:type="dxa"/>
+            </w:tcMar>
+          </w:tcPr>
+          <w:p>
+            <w:pPr>
+              <w:pStyle w:val="Normal"/>
+              <w:bidi w:val="0"/>
+              <w:jc w:val="start"/>
+              <w:rPr>
+                <w:rFonts w:ascii="Arial" w:hAnsi="Arial" w:eastAsia="Arial" w:cs="Arial"/>
+              </w:rPr>
+            </w:pPr>
+            <w:r>
+              <w:rPr>
+                <w:rFonts w:eastAsia="Arial" w:cs="Arial"/>
+              </w:rPr>
+              <w:t>Portions individuelles par recette (persons_map)</w:t>
+            </w:r>
+          </w:p>
+        </w:tc>
+        <w:tc>
+          <w:tcPr>
+            <w:tcW w:w="1800" w:type="dxa"/>
+            <w:tcBorders>
+              <w:top w:val="single" w:sz="2" w:space="0" w:color="CCCCCC"/>
+              <w:start w:val="single" w:sz="2" w:space="0" w:color="CCCCCC"/>
+              <w:bottom w:val="single" w:sz="2" w:space="0" w:color="CCCCCC"/>
+              <w:end w:val="single" w:sz="2" w:space="0" w:color="CCCCCC"/>
+            </w:tcBorders>
+            <w:shd w:fill="D1FAE5" w:val="clear"/>
+            <w:tcMar>
+              <w:top w:w="70" w:type="dxa"/>
+              <w:bottom w:w="70" w:type="dxa"/>
+            </w:tcMar>
+          </w:tcPr>
+          <w:p>
+            <w:pPr>
+              <w:pStyle w:val="Normal"/>
+              <w:bidi w:val="0"/>
+              <w:jc w:val="start"/>
+              <w:rPr>
+                <w:rFonts w:ascii="Arial" w:hAnsi="Arial" w:eastAsia="Arial" w:cs="Arial"/>
+              </w:rPr>
+            </w:pPr>
+            <w:r>
+              <w:rPr>
+                <w:rFonts w:eastAsia="Arial" w:cs="Arial"/>
+              </w:rPr>
+              <w:t>✅ Livré</w:t>
+            </w:r>
+          </w:p>
+        </w:tc>
+        <w:tc>
+          <w:tcPr>
+            <w:tcW w:w="3361" w:type="dxa"/>
+            <w:tcBorders>
+              <w:top w:val="single" w:sz="2" w:space="0" w:color="CCCCCC"/>
+              <w:start w:val="single" w:sz="2" w:space="0" w:color="CCCCCC"/>
+              <w:bottom w:val="single" w:sz="2" w:space="0" w:color="CCCCCC"/>
+              <w:end w:val="single" w:sz="2" w:space="0" w:color="CCCCCC"/>
+            </w:tcBorders>
+            <w:shd w:fill="D1FAE5" w:val="clear"/>
+            <w:tcMar>
+              <w:top w:w="70" w:type="dxa"/>
+              <w:bottom w:w="70" w:type="dxa"/>
+            </w:tcMar>
+          </w:tcPr>
+          <w:p>
+            <w:pPr>
+              <w:pStyle w:val="Normal"/>
+              <w:bidi w:val="0"/>
+              <w:jc w:val="start"/>
+              <w:rPr>
+                <w:rFonts w:ascii="Arial" w:hAnsi="Arial" w:eastAsia="Arial" w:cs="Arial"/>
+              </w:rPr>
+            </w:pPr>
+            <w:r>
+              <w:rPr>
+                <w:rFonts w:eastAsia="Arial" w:cs="Arial"/>
+              </w:rPr>
+              <w:t>Backend : db.py + main.py — chaque recette scalée selon ses propres portions envoyées dans recipe_portions</w:t>
+            </w:r>
+          </w:p>
+        </w:tc>
+      </w:tr>
+      <w:tr>
+        <w:trPr/>
+        <w:tc>
+          <w:tcPr>
+            <w:tcW w:w="4199" w:type="dxa"/>
+            <w:tcBorders>
+              <w:top w:val="single" w:sz="2" w:space="0" w:color="CCCCCC"/>
+              <w:start w:val="single" w:sz="2" w:space="0" w:color="CCCCCC"/>
+              <w:bottom w:val="single" w:sz="2" w:space="0" w:color="CCCCCC"/>
+              <w:end w:val="single" w:sz="2" w:space="0" w:color="CCCCCC"/>
+            </w:tcBorders>
+            <w:shd w:fill="FFFFFF" w:val="clear"/>
+            <w:tcMar>
+              <w:top w:w="70" w:type="dxa"/>
+              <w:bottom w:w="70" w:type="dxa"/>
+            </w:tcMar>
+          </w:tcPr>
+          <w:p>
+            <w:pPr>
+              <w:pStyle w:val="Normal"/>
+              <w:bidi w:val="0"/>
+              <w:jc w:val="start"/>
+              <w:rPr>
+                <w:rFonts w:ascii="Arial" w:hAnsi="Arial" w:eastAsia="Arial" w:cs="Arial"/>
+              </w:rPr>
+            </w:pPr>
+            <w:r>
+              <w:rPr>
+                <w:rFonts w:eastAsia="Arial" w:cs="Arial"/>
+              </w:rPr>
+              <w:t>Articles abandonnés proposés en Step 3</w:t>
+            </w:r>
+          </w:p>
+        </w:tc>
+        <w:tc>
+          <w:tcPr>
+            <w:tcW w:w="1800" w:type="dxa"/>
+            <w:tcBorders>
+              <w:top w:val="single" w:sz="2" w:space="0" w:color="CCCCCC"/>
+              <w:start w:val="single" w:sz="2" w:space="0" w:color="CCCCCC"/>
+              <w:bottom w:val="single" w:sz="2" w:space="0" w:color="CCCCCC"/>
+              <w:end w:val="single" w:sz="2" w:space="0" w:color="CCCCCC"/>
+            </w:tcBorders>
+            <w:shd w:fill="FFFFFF" w:val="clear"/>
+            <w:tcMar>
+              <w:top w:w="70" w:type="dxa"/>
+              <w:bottom w:w="70" w:type="dxa"/>
+            </w:tcMar>
+          </w:tcPr>
+          <w:p>
+            <w:pPr>
+              <w:pStyle w:val="Normal"/>
+              <w:bidi w:val="0"/>
+              <w:jc w:val="start"/>
+              <w:rPr>
+                <w:rFonts w:ascii="Arial" w:hAnsi="Arial" w:eastAsia="Arial" w:cs="Arial"/>
+              </w:rPr>
+            </w:pPr>
+            <w:r>
+              <w:rPr>
+                <w:rFonts w:eastAsia="Arial" w:cs="Arial"/>
+              </w:rPr>
+              <w:t>✅ Livré</w:t>
+            </w:r>
+          </w:p>
+        </w:tc>
+        <w:tc>
+          <w:tcPr>
+            <w:tcW w:w="3361" w:type="dxa"/>
+            <w:tcBorders>
+              <w:top w:val="single" w:sz="2" w:space="0" w:color="CCCCCC"/>
+              <w:start w:val="single" w:sz="2" w:space="0" w:color="CCCCCC"/>
+              <w:bottom w:val="single" w:sz="2" w:space="0" w:color="CCCCCC"/>
+              <w:end w:val="single" w:sz="2" w:space="0" w:color="CCCCCC"/>
+            </w:tcBorders>
+            <w:shd w:fill="FFFFFF" w:val="clear"/>
+            <w:tcMar>
+              <w:top w:w="70" w:type="dxa"/>
+              <w:bottom w:w="70" w:type="dxa"/>
+            </w:tcMar>
+          </w:tcPr>
+          <w:p>
+            <w:pPr>
+              <w:pStyle w:val="Normal"/>
+              <w:bidi w:val="0"/>
+              <w:jc w:val="start"/>
+              <w:rPr>
+                <w:rFonts w:ascii="Arial" w:hAnsi="Arial" w:eastAsia="Arial" w:cs="Arial"/>
+              </w:rPr>
+            </w:pPr>
+            <w:r>
+              <w:rPr>
+                <w:rFonts w:eastAsia="Arial" w:cs="Arial"/>
+              </w:rPr>
+              <w:t>Déplacé de ShoppingList vers ShoppingSelect StepRevision — bandeau orange avant confirmation</w:t>
+            </w:r>
+          </w:p>
+        </w:tc>
+      </w:tr>
+      <w:tr>
+        <w:trPr/>
+        <w:tc>
+          <w:tcPr>
+            <w:tcW w:w="4199" w:type="dxa"/>
+            <w:tcBorders>
+              <w:top w:val="single" w:sz="2" w:space="0" w:color="CCCCCC"/>
+              <w:start w:val="single" w:sz="2" w:space="0" w:color="CCCCCC"/>
+              <w:bottom w:val="single" w:sz="2" w:space="0" w:color="CCCCCC"/>
+              <w:end w:val="single" w:sz="2" w:space="0" w:color="CCCCCC"/>
+            </w:tcBorders>
+            <w:shd w:fill="D1FAE5" w:val="clear"/>
+            <w:tcMar>
+              <w:top w:w="70" w:type="dxa"/>
+              <w:bottom w:w="70" w:type="dxa"/>
+            </w:tcMar>
+          </w:tcPr>
+          <w:p>
+            <w:pPr>
+              <w:pStyle w:val="Normal"/>
+              <w:bidi w:val="0"/>
+              <w:jc w:val="start"/>
+              <w:rPr>
+                <w:rFonts w:ascii="Arial" w:hAnsi="Arial" w:eastAsia="Arial" w:cs="Arial"/>
+              </w:rPr>
+            </w:pPr>
+            <w:r>
+              <w:rPr>
+                <w:rFonts w:eastAsia="Arial" w:cs="Arial"/>
+              </w:rPr>
+              <w:t>Icônes PWA recadrées (mai 2026)</w:t>
+            </w:r>
+          </w:p>
+        </w:tc>
+        <w:tc>
+          <w:tcPr>
+            <w:tcW w:w="1800" w:type="dxa"/>
+            <w:tcBorders>
+              <w:top w:val="single" w:sz="2" w:space="0" w:color="CCCCCC"/>
+              <w:start w:val="single" w:sz="2" w:space="0" w:color="CCCCCC"/>
+              <w:bottom w:val="single" w:sz="2" w:space="0" w:color="CCCCCC"/>
+              <w:end w:val="single" w:sz="2" w:space="0" w:color="CCCCCC"/>
+            </w:tcBorders>
+            <w:shd w:fill="D1FAE5" w:val="clear"/>
+            <w:tcMar>
+              <w:top w:w="70" w:type="dxa"/>
+              <w:bottom w:w="70" w:type="dxa"/>
+            </w:tcMar>
+          </w:tcPr>
+          <w:p>
+            <w:pPr>
+              <w:pStyle w:val="Normal"/>
+              <w:bidi w:val="0"/>
+              <w:jc w:val="start"/>
+              <w:rPr>
+                <w:rFonts w:ascii="Arial" w:hAnsi="Arial" w:eastAsia="Arial" w:cs="Arial"/>
+              </w:rPr>
+            </w:pPr>
+            <w:r>
+              <w:rPr>
+                <w:rFonts w:eastAsia="Arial" w:cs="Arial"/>
+              </w:rPr>
+              <w:t>✅ Livré</w:t>
+            </w:r>
+          </w:p>
+        </w:tc>
+        <w:tc>
+          <w:tcPr>
+            <w:tcW w:w="3361" w:type="dxa"/>
+            <w:tcBorders>
+              <w:top w:val="single" w:sz="2" w:space="0" w:color="CCCCCC"/>
+              <w:start w:val="single" w:sz="2" w:space="0" w:color="CCCCCC"/>
+              <w:bottom w:val="single" w:sz="2" w:space="0" w:color="CCCCCC"/>
+              <w:end w:val="single" w:sz="2" w:space="0" w:color="CCCCCC"/>
+            </w:tcBorders>
+            <w:shd w:fill="D1FAE5" w:val="clear"/>
+            <w:tcMar>
+              <w:top w:w="70" w:type="dxa"/>
+              <w:bottom w:w="70" w:type="dxa"/>
+            </w:tcMar>
+          </w:tcPr>
+          <w:p>
+            <w:pPr>
+              <w:pStyle w:val="Normal"/>
+              <w:bidi w:val="0"/>
+              <w:jc w:val="start"/>
+              <w:rPr>
+                <w:rFonts w:ascii="Arial" w:hAnsi="Arial" w:eastAsia="Arial" w:cs="Arial"/>
+              </w:rPr>
+            </w:pPr>
+            <w:r>
+              <w:rPr>
+                <w:rFonts w:eastAsia="Arial" w:cs="Arial"/>
+              </w:rPr>
+              <w:t>Regénérées avec padding 8% + décalage vertical — meilleur rendu Android</w:t>
+            </w:r>
+          </w:p>
+        </w:tc>
+      </w:tr>
+    </w:tbl>
+    <w:p>
+      <w:pPr>
+        <w:pStyle w:val="Normal"/>
+        <w:bidi w:val="0"/>
+        <w:spacing w:before="200" w:after="0"/>
+        <w:jc w:val="start"/>
+        <w:rPr/>
+      </w:pPr>
+      <w:r>
+        <w:rPr/>
+      </w:r>
+    </w:p>
+    <w:p>
+      <w:pPr>
+        <w:pStyle w:val="Heading3"/>
+        <w:bidi w:val="0"/>
+        <w:spacing w:before="280" w:after="100"/>
+        <w:jc w:val="start"/>
+        <w:rPr>
+          <w:rFonts w:ascii="Arial" w:hAnsi="Arial" w:eastAsia="Arial" w:cs="Arial"/>
+          <w:b/>
+          <w:bCs/>
+          <w:color w:val="374151"/>
+          <w:sz w:val="24"/>
+          <w:szCs w:val="24"/>
+        </w:rPr>
+      </w:pPr>
+      <w:r>
+        <w:rPr>
+          <w:rFonts w:eastAsia="Arial" w:cs="Arial" w:ascii="Arial" w:hAnsi="Arial"/>
+          <w:b/>
+          <w:bCs/>
+          <w:color w:val="374151"/>
+          <w:sz w:val="24"/>
+          <w:szCs w:val="24"/>
+        </w:rPr>
+        <w:t>🔴 AUDIT — Bugs critiques à corriger (Haute priorité)</w:t>
+      </w:r>
+    </w:p>
+    <w:tbl>
+      <w:tblPr>
+        <w:tblW w:w="9360" w:type="dxa"/>
+        <w:jc w:val="start"/>
+        <w:tblInd w:w="0" w:type="dxa"/>
+        <w:tblLayout w:type="fixed"/>
+        <w:tblCellMar>
+          <w:top w:w="80" w:type="dxa"/>
+          <w:start w:w="120" w:type="dxa"/>
+          <w:bottom w:w="80" w:type="dxa"/>
+          <w:end w:w="120" w:type="dxa"/>
+        </w:tblCellMar>
+      </w:tblPr>
+      <w:tblGrid>
+        <w:gridCol w:w="4199"/>
+        <w:gridCol w:w="1800"/>
+        <w:gridCol w:w="3361"/>
+      </w:tblGrid>
+      <w:tr>
+        <w:trPr>
+          <w:tblHeader w:val="true"/>
+        </w:trPr>
+        <w:tc>
+          <w:tcPr>
+            <w:tcW w:w="4199" w:type="dxa"/>
+            <w:tcBorders>
+              <w:top w:val="single" w:sz="2" w:space="0" w:color="CCCCCC"/>
+              <w:start w:val="single" w:sz="2" w:space="0" w:color="CCCCCC"/>
+              <w:bottom w:val="single" w:sz="2" w:space="0" w:color="CCCCCC"/>
+              <w:end w:val="single" w:sz="2" w:space="0" w:color="CCCCCC"/>
+            </w:tcBorders>
+            <w:shd w:fill="1F2937" w:val="clear"/>
+          </w:tcPr>
+          <w:p>
+            <w:pPr>
+              <w:pStyle w:val="Normal"/>
+              <w:bidi w:val="0"/>
+              <w:jc w:val="start"/>
+              <w:rPr>
+                <w:rFonts w:ascii="Arial" w:hAnsi="Arial" w:eastAsia="Arial" w:cs="Arial"/>
+                <w:b/>
+                <w:bCs/>
+                <w:color w:val="FFFFFF"/>
+                <w:sz w:val="20"/>
+                <w:szCs w:val="20"/>
+              </w:rPr>
+            </w:pPr>
+            <w:r>
+              <w:rPr>
+                <w:rFonts w:eastAsia="Arial" w:cs="Arial"/>
+                <w:b/>
+                <w:bCs/>
+                <w:color w:val="FFFFFF"/>
+                <w:sz w:val="20"/>
+                <w:szCs w:val="20"/>
+              </w:rPr>
+              <w:t>Fonctionnalité</w:t>
+            </w:r>
+          </w:p>
+        </w:tc>
+        <w:tc>
+          <w:tcPr>
+            <w:tcW w:w="1800" w:type="dxa"/>
+            <w:tcBorders>
+              <w:top w:val="single" w:sz="2" w:space="0" w:color="CCCCCC"/>
+              <w:start w:val="single" w:sz="2" w:space="0" w:color="CCCCCC"/>
+              <w:bottom w:val="single" w:sz="2" w:space="0" w:color="CCCCCC"/>
+              <w:end w:val="single" w:sz="2" w:space="0" w:color="CCCCCC"/>
+            </w:tcBorders>
+            <w:shd w:fill="1F2937" w:val="clear"/>
+          </w:tcPr>
+          <w:p>
+            <w:pPr>
+              <w:pStyle w:val="Normal"/>
+              <w:bidi w:val="0"/>
+              <w:jc w:val="start"/>
+              <w:rPr>
+                <w:rFonts w:ascii="Arial" w:hAnsi="Arial" w:eastAsia="Arial" w:cs="Arial"/>
+                <w:b/>
+                <w:bCs/>
+                <w:color w:val="FFFFFF"/>
+                <w:sz w:val="20"/>
+                <w:szCs w:val="20"/>
+              </w:rPr>
+            </w:pPr>
+            <w:r>
+              <w:rPr>
+                <w:rFonts w:eastAsia="Arial" w:cs="Arial"/>
+                <w:b/>
+                <w:bCs/>
+                <w:color w:val="FFFFFF"/>
+                <w:sz w:val="20"/>
+                <w:szCs w:val="20"/>
+              </w:rPr>
+              <w:t>Effort</w:t>
+            </w:r>
+          </w:p>
+        </w:tc>
+        <w:tc>
+          <w:tcPr>
+            <w:tcW w:w="3361" w:type="dxa"/>
+            <w:tcBorders>
+              <w:top w:val="single" w:sz="2" w:space="0" w:color="CCCCCC"/>
+              <w:start w:val="single" w:sz="2" w:space="0" w:color="CCCCCC"/>
+              <w:bottom w:val="single" w:sz="2" w:space="0" w:color="CCCCCC"/>
+              <w:end w:val="single" w:sz="2" w:space="0" w:color="CCCCCC"/>
+            </w:tcBorders>
+            <w:shd w:fill="1F2937" w:val="clear"/>
+          </w:tcPr>
+          <w:p>
+            <w:pPr>
+              <w:pStyle w:val="Normal"/>
+              <w:bidi w:val="0"/>
+              <w:jc w:val="start"/>
+              <w:rPr>
+                <w:rFonts w:ascii="Arial" w:hAnsi="Arial" w:eastAsia="Arial" w:cs="Arial"/>
+                <w:b/>
+                <w:bCs/>
+                <w:color w:val="FFFFFF"/>
+                <w:sz w:val="20"/>
+                <w:szCs w:val="20"/>
+              </w:rPr>
+            </w:pPr>
+            <w:r>
+              <w:rPr>
+                <w:rFonts w:eastAsia="Arial" w:cs="Arial"/>
+                <w:b/>
+                <w:bCs/>
+                <w:color w:val="FFFFFF"/>
+                <w:sz w:val="20"/>
+                <w:szCs w:val="20"/>
+              </w:rPr>
+              <w:t>Détail</w:t>
+            </w:r>
+          </w:p>
+        </w:tc>
+      </w:tr>
+      <w:tr>
+        <w:trPr/>
+        <w:tc>
+          <w:tcPr>
+            <w:tcW w:w="4199" w:type="dxa"/>
+            <w:tcBorders>
+              <w:top w:val="single" w:sz="2" w:space="0" w:color="CCCCCC"/>
+              <w:start w:val="single" w:sz="2" w:space="0" w:color="CCCCCC"/>
+              <w:bottom w:val="single" w:sz="2" w:space="0" w:color="CCCCCC"/>
+              <w:end w:val="single" w:sz="2" w:space="0" w:color="CCCCCC"/>
+            </w:tcBorders>
+            <w:shd w:fill="FFFFFF" w:val="clear"/>
+            <w:tcMar>
+              <w:top w:w="70" w:type="dxa"/>
+              <w:bottom w:w="70" w:type="dxa"/>
+            </w:tcMar>
+          </w:tcPr>
+          <w:p>
+            <w:pPr>
+              <w:pStyle w:val="Normal"/>
+              <w:bidi w:val="0"/>
+              <w:jc w:val="start"/>
+              <w:rPr>
+                <w:rFonts w:ascii="Arial" w:hAnsi="Arial" w:eastAsia="Arial" w:cs="Arial"/>
+              </w:rPr>
+            </w:pPr>
+            <w:r>
+              <w:rPr>
+                <w:rFonts w:eastAsia="Arial" w:cs="Arial"/>
+              </w:rPr>
+              <w:t>✅ base_servings = 0 → crash Infinity dans RecipeDetail</w:t>
+            </w:r>
+          </w:p>
+        </w:tc>
+        <w:tc>
+          <w:tcPr>
+            <w:tcW w:w="1800" w:type="dxa"/>
+            <w:tcBorders>
+              <w:top w:val="single" w:sz="2" w:space="0" w:color="CCCCCC"/>
+              <w:start w:val="single" w:sz="2" w:space="0" w:color="CCCCCC"/>
+              <w:bottom w:val="single" w:sz="2" w:space="0" w:color="CCCCCC"/>
+              <w:end w:val="single" w:sz="2" w:space="0" w:color="CCCCCC"/>
+            </w:tcBorders>
+            <w:shd w:fill="FFFFFF" w:val="clear"/>
+            <w:tcMar>
+              <w:top w:w="70" w:type="dxa"/>
+              <w:bottom w:w="70" w:type="dxa"/>
+            </w:tcMar>
+          </w:tcPr>
+          <w:p>
+            <w:pPr>
+              <w:pStyle w:val="Normal"/>
+              <w:bidi w:val="0"/>
+              <w:jc w:val="start"/>
+              <w:rPr>
+                <w:rFonts w:ascii="Arial" w:hAnsi="Arial" w:eastAsia="Arial" w:cs="Arial"/>
+              </w:rPr>
+            </w:pPr>
+            <w:r>
+              <w:rPr>
+                <w:rFonts w:eastAsia="Arial" w:cs="Arial"/>
+              </w:rPr>
+              <w:t>Faible</w:t>
+            </w:r>
+          </w:p>
+        </w:tc>
+        <w:tc>
+          <w:tcPr>
+            <w:tcW w:w="3361" w:type="dxa"/>
+            <w:tcBorders>
+              <w:top w:val="single" w:sz="2" w:space="0" w:color="CCCCCC"/>
+              <w:start w:val="single" w:sz="2" w:space="0" w:color="CCCCCC"/>
+              <w:bottom w:val="single" w:sz="2" w:space="0" w:color="CCCCCC"/>
+              <w:end w:val="single" w:sz="2" w:space="0" w:color="CCCCCC"/>
+            </w:tcBorders>
+            <w:shd w:fill="FFFFFF" w:val="clear"/>
+            <w:tcMar>
+              <w:top w:w="70" w:type="dxa"/>
+              <w:bottom w:w="70" w:type="dxa"/>
+            </w:tcMar>
+          </w:tcPr>
+          <w:p>
+            <w:pPr>
+              <w:pStyle w:val="Normal"/>
+              <w:bidi w:val="0"/>
+              <w:jc w:val="start"/>
+              <w:rPr>
+                <w:rFonts w:ascii="Arial" w:hAnsi="Arial" w:eastAsia="Arial" w:cs="Arial"/>
+              </w:rPr>
+            </w:pPr>
+            <w:r>
+              <w:rPr>
+                <w:rFonts w:eastAsia="Arial" w:cs="Arial"/>
+              </w:rPr>
+              <w:t>guard `|| 1` frontend (RecipeDetail.jsx l.50) + `ge=0.1` Pydantic backend sur base_servings</w:t>
+            </w:r>
+          </w:p>
+        </w:tc>
+      </w:tr>
+      <w:tr>
+        <w:trPr/>
+        <w:tc>
+          <w:tcPr>
+            <w:tcW w:w="4199" w:type="dxa"/>
+            <w:tcBorders>
+              <w:top w:val="single" w:sz="2" w:space="0" w:color="CCCCCC"/>
+              <w:start w:val="single" w:sz="2" w:space="0" w:color="CCCCCC"/>
+              <w:bottom w:val="single" w:sz="2" w:space="0" w:color="CCCCCC"/>
+              <w:end w:val="single" w:sz="2" w:space="0" w:color="CCCCCC"/>
+            </w:tcBorders>
+            <w:shd w:fill="F9FAFB" w:val="clear"/>
+            <w:tcMar>
+              <w:top w:w="70" w:type="dxa"/>
+              <w:bottom w:w="70" w:type="dxa"/>
+            </w:tcMar>
+          </w:tcPr>
+          <w:p>
+            <w:pPr>
+              <w:pStyle w:val="Normal"/>
+              <w:bidi w:val="0"/>
+              <w:jc w:val="start"/>
+              <w:rPr>
+                <w:rFonts w:ascii="Arial" w:hAnsi="Arial" w:eastAsia="Arial" w:cs="Arial"/>
+              </w:rPr>
+            </w:pPr>
+            <w:r>
+              <w:rPr>
+                <w:rFonts w:eastAsia="Arial" w:cs="Arial"/>
+              </w:rPr>
+              <w:t>✅ persons: 0 envoyé à API → liste générée avec 0g partout</w:t>
+            </w:r>
+          </w:p>
+        </w:tc>
+        <w:tc>
+          <w:tcPr>
+            <w:tcW w:w="1800" w:type="dxa"/>
+            <w:tcBorders>
+              <w:top w:val="single" w:sz="2" w:space="0" w:color="CCCCCC"/>
+              <w:start w:val="single" w:sz="2" w:space="0" w:color="CCCCCC"/>
+              <w:bottom w:val="single" w:sz="2" w:space="0" w:color="CCCCCC"/>
+              <w:end w:val="single" w:sz="2" w:space="0" w:color="CCCCCC"/>
+            </w:tcBorders>
+            <w:shd w:fill="F9FAFB" w:val="clear"/>
+            <w:tcMar>
+              <w:top w:w="70" w:type="dxa"/>
+              <w:bottom w:w="70" w:type="dxa"/>
+            </w:tcMar>
+          </w:tcPr>
+          <w:p>
+            <w:pPr>
+              <w:pStyle w:val="Normal"/>
+              <w:bidi w:val="0"/>
+              <w:jc w:val="start"/>
+              <w:rPr>
+                <w:rFonts w:ascii="Arial" w:hAnsi="Arial" w:eastAsia="Arial" w:cs="Arial"/>
+              </w:rPr>
+            </w:pPr>
+            <w:r>
+              <w:rPr>
+                <w:rFonts w:eastAsia="Arial" w:cs="Arial"/>
+              </w:rPr>
+              <w:t>Faible</w:t>
+            </w:r>
+          </w:p>
+        </w:tc>
+        <w:tc>
+          <w:tcPr>
+            <w:tcW w:w="3361" w:type="dxa"/>
+            <w:tcBorders>
+              <w:top w:val="single" w:sz="2" w:space="0" w:color="CCCCCC"/>
+              <w:start w:val="single" w:sz="2" w:space="0" w:color="CCCCCC"/>
+              <w:bottom w:val="single" w:sz="2" w:space="0" w:color="CCCCCC"/>
+              <w:end w:val="single" w:sz="2" w:space="0" w:color="CCCCCC"/>
+            </w:tcBorders>
+            <w:shd w:fill="F9FAFB" w:val="clear"/>
+            <w:tcMar>
+              <w:top w:w="70" w:type="dxa"/>
+              <w:bottom w:w="70" w:type="dxa"/>
+            </w:tcMar>
+          </w:tcPr>
+          <w:p>
+            <w:pPr>
+              <w:pStyle w:val="Normal"/>
+              <w:bidi w:val="0"/>
+              <w:jc w:val="start"/>
+              <w:rPr>
+                <w:rFonts w:ascii="Arial" w:hAnsi="Arial" w:eastAsia="Arial" w:cs="Arial"/>
+              </w:rPr>
+            </w:pPr>
+            <w:r>
+              <w:rPr>
+                <w:rFonts w:eastAsia="Arial" w:cs="Arial"/>
+              </w:rPr>
+              <w:t>`ge=0.1` sur GenerateShoppingRequest.persons et recipe_portions values</w:t>
+            </w:r>
+          </w:p>
+        </w:tc>
+      </w:tr>
+      <w:tr>
+        <w:trPr/>
+        <w:tc>
+          <w:tcPr>
+            <w:tcW w:w="4199" w:type="dxa"/>
+            <w:tcBorders>
+              <w:top w:val="single" w:sz="2" w:space="0" w:color="CCCCCC"/>
+              <w:start w:val="single" w:sz="2" w:space="0" w:color="CCCCCC"/>
+              <w:bottom w:val="single" w:sz="2" w:space="0" w:color="CCCCCC"/>
+              <w:end w:val="single" w:sz="2" w:space="0" w:color="CCCCCC"/>
+            </w:tcBorders>
+            <w:shd w:fill="FFFFFF" w:val="clear"/>
+            <w:tcMar>
+              <w:top w:w="70" w:type="dxa"/>
+              <w:bottom w:w="70" w:type="dxa"/>
+            </w:tcMar>
+          </w:tcPr>
+          <w:p>
+            <w:pPr>
+              <w:pStyle w:val="Normal"/>
+              <w:bidi w:val="0"/>
+              <w:jc w:val="start"/>
+              <w:rPr>
+                <w:rFonts w:ascii="Arial" w:hAnsi="Arial" w:eastAsia="Arial" w:cs="Arial"/>
+              </w:rPr>
+            </w:pPr>
+            <w:r>
+              <w:rPr>
+                <w:rFonts w:eastAsia="Arial" w:cs="Arial"/>
+              </w:rPr>
+              <w:t>✅ FocusMode crash si recette sans étapes</w:t>
+            </w:r>
+          </w:p>
+        </w:tc>
+        <w:tc>
+          <w:tcPr>
+            <w:tcW w:w="1800" w:type="dxa"/>
+            <w:tcBorders>
+              <w:top w:val="single" w:sz="2" w:space="0" w:color="CCCCCC"/>
+              <w:start w:val="single" w:sz="2" w:space="0" w:color="CCCCCC"/>
+              <w:bottom w:val="single" w:sz="2" w:space="0" w:color="CCCCCC"/>
+              <w:end w:val="single" w:sz="2" w:space="0" w:color="CCCCCC"/>
+            </w:tcBorders>
+            <w:shd w:fill="FFFFFF" w:val="clear"/>
+            <w:tcMar>
+              <w:top w:w="70" w:type="dxa"/>
+              <w:bottom w:w="70" w:type="dxa"/>
+            </w:tcMar>
+          </w:tcPr>
+          <w:p>
+            <w:pPr>
+              <w:pStyle w:val="Normal"/>
+              <w:bidi w:val="0"/>
+              <w:jc w:val="start"/>
+              <w:rPr>
+                <w:rFonts w:ascii="Arial" w:hAnsi="Arial" w:eastAsia="Arial" w:cs="Arial"/>
+              </w:rPr>
+            </w:pPr>
+            <w:r>
+              <w:rPr>
+                <w:rFonts w:eastAsia="Arial" w:cs="Arial"/>
+              </w:rPr>
+              <w:t>Faible</w:t>
+            </w:r>
+          </w:p>
+        </w:tc>
+        <w:tc>
+          <w:tcPr>
+            <w:tcW w:w="3361" w:type="dxa"/>
+            <w:tcBorders>
+              <w:top w:val="single" w:sz="2" w:space="0" w:color="CCCCCC"/>
+              <w:start w:val="single" w:sz="2" w:space="0" w:color="CCCCCC"/>
+              <w:bottom w:val="single" w:sz="2" w:space="0" w:color="CCCCCC"/>
+              <w:end w:val="single" w:sz="2" w:space="0" w:color="CCCCCC"/>
+            </w:tcBorders>
+            <w:shd w:fill="FFFFFF" w:val="clear"/>
+            <w:tcMar>
+              <w:top w:w="70" w:type="dxa"/>
+              <w:bottom w:w="70" w:type="dxa"/>
+            </w:tcMar>
+          </w:tcPr>
+          <w:p>
+            <w:pPr>
+              <w:pStyle w:val="Normal"/>
+              <w:bidi w:val="0"/>
+              <w:jc w:val="start"/>
+              <w:rPr>
+                <w:rFonts w:ascii="Arial" w:hAnsi="Arial" w:eastAsia="Arial" w:cs="Arial"/>
+              </w:rPr>
+            </w:pPr>
+            <w:r>
+              <w:rPr>
+                <w:rFonts w:eastAsia="Arial" w:cs="Arial"/>
+              </w:rPr>
+              <w:t>Guard `if steps.length === 0` avant render + ErrorBoundary globale</w:t>
+            </w:r>
+          </w:p>
+        </w:tc>
+      </w:tr>
+      <w:tr>
+        <w:trPr/>
+        <w:tc>
+          <w:tcPr>
+            <w:tcW w:w="4199" w:type="dxa"/>
+            <w:tcBorders>
+              <w:top w:val="single" w:sz="2" w:space="0" w:color="CCCCCC"/>
+              <w:start w:val="single" w:sz="2" w:space="0" w:color="CCCCCC"/>
+              <w:bottom w:val="single" w:sz="2" w:space="0" w:color="CCCCCC"/>
+              <w:end w:val="single" w:sz="2" w:space="0" w:color="CCCCCC"/>
+            </w:tcBorders>
+            <w:shd w:fill="F9FAFB" w:val="clear"/>
+            <w:tcMar>
+              <w:top w:w="70" w:type="dxa"/>
+              <w:bottom w:w="70" w:type="dxa"/>
+            </w:tcMar>
+          </w:tcPr>
+          <w:p>
+            <w:pPr>
+              <w:pStyle w:val="Normal"/>
+              <w:bidi w:val="0"/>
+              <w:jc w:val="start"/>
+              <w:rPr>
+                <w:rFonts w:ascii="Arial" w:hAnsi="Arial" w:eastAsia="Arial" w:cs="Arial"/>
+              </w:rPr>
+            </w:pPr>
+            <w:r>
+              <w:rPr>
+                <w:rFonts w:eastAsia="Arial" w:cs="Arial"/>
+              </w:rPr>
+              <w:t>✅ handleAddAbandoned : échec partiel → doublons à la prochaine liste</w:t>
+            </w:r>
+          </w:p>
+        </w:tc>
+        <w:tc>
+          <w:tcPr>
+            <w:tcW w:w="1800" w:type="dxa"/>
+            <w:tcBorders>
+              <w:top w:val="single" w:sz="2" w:space="0" w:color="CCCCCC"/>
+              <w:start w:val="single" w:sz="2" w:space="0" w:color="CCCCCC"/>
+              <w:bottom w:val="single" w:sz="2" w:space="0" w:color="CCCCCC"/>
+              <w:end w:val="single" w:sz="2" w:space="0" w:color="CCCCCC"/>
+            </w:tcBorders>
+            <w:shd w:fill="F9FAFB" w:val="clear"/>
+            <w:tcMar>
+              <w:top w:w="70" w:type="dxa"/>
+              <w:bottom w:w="70" w:type="dxa"/>
+            </w:tcMar>
+          </w:tcPr>
+          <w:p>
+            <w:pPr>
+              <w:pStyle w:val="Normal"/>
+              <w:bidi w:val="0"/>
+              <w:jc w:val="start"/>
+              <w:rPr>
+                <w:rFonts w:ascii="Arial" w:hAnsi="Arial" w:eastAsia="Arial" w:cs="Arial"/>
+              </w:rPr>
+            </w:pPr>
+            <w:r>
+              <w:rPr>
+                <w:rFonts w:eastAsia="Arial" w:cs="Arial"/>
+              </w:rPr>
+              <w:t>Faible</w:t>
+            </w:r>
+          </w:p>
+        </w:tc>
+        <w:tc>
+          <w:tcPr>
+            <w:tcW w:w="3361" w:type="dxa"/>
+            <w:tcBorders>
+              <w:top w:val="single" w:sz="2" w:space="0" w:color="CCCCCC"/>
+              <w:start w:val="single" w:sz="2" w:space="0" w:color="CCCCCC"/>
+              <w:bottom w:val="single" w:sz="2" w:space="0" w:color="CCCCCC"/>
+              <w:end w:val="single" w:sz="2" w:space="0" w:color="CCCCCC"/>
+            </w:tcBorders>
+            <w:shd w:fill="F9FAFB" w:val="clear"/>
+            <w:tcMar>
+              <w:top w:w="70" w:type="dxa"/>
+              <w:bottom w:w="70" w:type="dxa"/>
+            </w:tcMar>
+          </w:tcPr>
+          <w:p>
+            <w:pPr>
+              <w:pStyle w:val="Normal"/>
+              <w:bidi w:val="0"/>
+              <w:jc w:val="start"/>
+              <w:rPr>
+                <w:rFonts w:ascii="Arial" w:hAnsi="Arial" w:eastAsia="Arial" w:cs="Arial"/>
+              </w:rPr>
+            </w:pPr>
+            <w:r>
+              <w:rPr>
+                <w:rFonts w:eastAsia="Arial" w:cs="Arial"/>
+              </w:rPr>
+              <w:t>Vider sessionStorage au début (pas à la fin) + tracker items ajoutés un par un</w:t>
+            </w:r>
+          </w:p>
+        </w:tc>
+      </w:tr>
+      <w:tr>
+        <w:trPr/>
+        <w:tc>
+          <w:tcPr>
+            <w:tcW w:w="4199" w:type="dxa"/>
+            <w:tcBorders>
+              <w:top w:val="single" w:sz="2" w:space="0" w:color="CCCCCC"/>
+              <w:start w:val="single" w:sz="2" w:space="0" w:color="CCCCCC"/>
+              <w:bottom w:val="single" w:sz="2" w:space="0" w:color="CCCCCC"/>
+              <w:end w:val="single" w:sz="2" w:space="0" w:color="CCCCCC"/>
+            </w:tcBorders>
+            <w:shd w:fill="FFFFFF" w:val="clear"/>
+            <w:tcMar>
+              <w:top w:w="70" w:type="dxa"/>
+              <w:bottom w:w="70" w:type="dxa"/>
+            </w:tcMar>
+          </w:tcPr>
+          <w:p>
+            <w:pPr>
+              <w:pStyle w:val="Normal"/>
+              <w:bidi w:val="0"/>
+              <w:jc w:val="start"/>
+              <w:rPr>
+                <w:rFonts w:ascii="Arial" w:hAnsi="Arial" w:eastAsia="Arial" w:cs="Arial"/>
+              </w:rPr>
+            </w:pPr>
+            <w:r>
+              <w:rPr>
+                <w:rFonts w:eastAsia="Arial" w:cs="Arial"/>
+              </w:rPr>
+              <w:t>✅ appcook_abandoned non nettoyé après archivage normal</w:t>
+            </w:r>
+          </w:p>
+        </w:tc>
+        <w:tc>
+          <w:tcPr>
+            <w:tcW w:w="1800" w:type="dxa"/>
+            <w:tcBorders>
+              <w:top w:val="single" w:sz="2" w:space="0" w:color="CCCCCC"/>
+              <w:start w:val="single" w:sz="2" w:space="0" w:color="CCCCCC"/>
+              <w:bottom w:val="single" w:sz="2" w:space="0" w:color="CCCCCC"/>
+              <w:end w:val="single" w:sz="2" w:space="0" w:color="CCCCCC"/>
+            </w:tcBorders>
+            <w:shd w:fill="FFFFFF" w:val="clear"/>
+            <w:tcMar>
+              <w:top w:w="70" w:type="dxa"/>
+              <w:bottom w:w="70" w:type="dxa"/>
+            </w:tcMar>
+          </w:tcPr>
+          <w:p>
+            <w:pPr>
+              <w:pStyle w:val="Normal"/>
+              <w:bidi w:val="0"/>
+              <w:jc w:val="start"/>
+              <w:rPr>
+                <w:rFonts w:ascii="Arial" w:hAnsi="Arial" w:eastAsia="Arial" w:cs="Arial"/>
+              </w:rPr>
+            </w:pPr>
+            <w:r>
+              <w:rPr>
+                <w:rFonts w:eastAsia="Arial" w:cs="Arial"/>
+              </w:rPr>
+              <w:t>Faible</w:t>
+            </w:r>
+          </w:p>
+        </w:tc>
+        <w:tc>
+          <w:tcPr>
+            <w:tcW w:w="3361" w:type="dxa"/>
+            <w:tcBorders>
+              <w:top w:val="single" w:sz="2" w:space="0" w:color="CCCCCC"/>
+              <w:start w:val="single" w:sz="2" w:space="0" w:color="CCCCCC"/>
+              <w:bottom w:val="single" w:sz="2" w:space="0" w:color="CCCCCC"/>
+              <w:end w:val="single" w:sz="2" w:space="0" w:color="CCCCCC"/>
+            </w:tcBorders>
+            <w:shd w:fill="FFFFFF" w:val="clear"/>
+            <w:tcMar>
+              <w:top w:w="70" w:type="dxa"/>
+              <w:bottom w:w="70" w:type="dxa"/>
+            </w:tcMar>
+          </w:tcPr>
+          <w:p>
+            <w:pPr>
+              <w:pStyle w:val="Normal"/>
+              <w:bidi w:val="0"/>
+              <w:jc w:val="start"/>
+              <w:rPr>
+                <w:rFonts w:ascii="Arial" w:hAnsi="Arial" w:eastAsia="Arial" w:cs="Arial"/>
+              </w:rPr>
+            </w:pPr>
+            <w:r>
+              <w:rPr>
+                <w:rFonts w:eastAsia="Arial" w:cs="Arial"/>
+              </w:rPr>
+              <w:t>Ajouter `sessionStorage.removeItem(appcook_abandoned)` dans handleComplete de ShoppingList.jsx</w:t>
+            </w:r>
+          </w:p>
+        </w:tc>
+      </w:tr>
+      <w:tr>
+        <w:trPr/>
+        <w:tc>
+          <w:tcPr>
+            <w:tcW w:w="4199" w:type="dxa"/>
+            <w:tcBorders>
+              <w:top w:val="single" w:sz="2" w:space="0" w:color="CCCCCC"/>
+              <w:start w:val="single" w:sz="2" w:space="0" w:color="CCCCCC"/>
+              <w:bottom w:val="single" w:sz="2" w:space="0" w:color="CCCCCC"/>
+              <w:end w:val="single" w:sz="2" w:space="0" w:color="CCCCCC"/>
+            </w:tcBorders>
+            <w:shd w:fill="F9FAFB" w:val="clear"/>
+            <w:tcMar>
+              <w:top w:w="70" w:type="dxa"/>
+              <w:bottom w:w="70" w:type="dxa"/>
+            </w:tcMar>
+          </w:tcPr>
+          <w:p>
+            <w:pPr>
+              <w:pStyle w:val="Normal"/>
+              <w:bidi w:val="0"/>
+              <w:jc w:val="start"/>
+              <w:rPr>
+                <w:rFonts w:ascii="Arial" w:hAnsi="Arial" w:eastAsia="Arial" w:cs="Arial"/>
+              </w:rPr>
+            </w:pPr>
+            <w:r>
+              <w:rPr>
+                <w:rFonts w:eastAsia="Arial" w:cs="Arial"/>
+              </w:rPr>
+              <w:t>✅ import_recipe_from_json : KeyError 500 si ingrédient sans name</w:t>
+            </w:r>
+          </w:p>
+        </w:tc>
+        <w:tc>
+          <w:tcPr>
+            <w:tcW w:w="1800" w:type="dxa"/>
+            <w:tcBorders>
+              <w:top w:val="single" w:sz="2" w:space="0" w:color="CCCCCC"/>
+              <w:start w:val="single" w:sz="2" w:space="0" w:color="CCCCCC"/>
+              <w:bottom w:val="single" w:sz="2" w:space="0" w:color="CCCCCC"/>
+              <w:end w:val="single" w:sz="2" w:space="0" w:color="CCCCCC"/>
+            </w:tcBorders>
+            <w:shd w:fill="F9FAFB" w:val="clear"/>
+            <w:tcMar>
+              <w:top w:w="70" w:type="dxa"/>
+              <w:bottom w:w="70" w:type="dxa"/>
+            </w:tcMar>
+          </w:tcPr>
+          <w:p>
+            <w:pPr>
+              <w:pStyle w:val="Normal"/>
+              <w:bidi w:val="0"/>
+              <w:jc w:val="start"/>
+              <w:rPr>
+                <w:rFonts w:ascii="Arial" w:hAnsi="Arial" w:eastAsia="Arial" w:cs="Arial"/>
+              </w:rPr>
+            </w:pPr>
+            <w:r>
+              <w:rPr>
+                <w:rFonts w:eastAsia="Arial" w:cs="Arial"/>
+              </w:rPr>
+              <w:t>Faible</w:t>
+            </w:r>
+          </w:p>
+        </w:tc>
+        <w:tc>
+          <w:tcPr>
+            <w:tcW w:w="3361" w:type="dxa"/>
+            <w:tcBorders>
+              <w:top w:val="single" w:sz="2" w:space="0" w:color="CCCCCC"/>
+              <w:start w:val="single" w:sz="2" w:space="0" w:color="CCCCCC"/>
+              <w:bottom w:val="single" w:sz="2" w:space="0" w:color="CCCCCC"/>
+              <w:end w:val="single" w:sz="2" w:space="0" w:color="CCCCCC"/>
+            </w:tcBorders>
+            <w:shd w:fill="F9FAFB" w:val="clear"/>
+            <w:tcMar>
+              <w:top w:w="70" w:type="dxa"/>
+              <w:bottom w:w="70" w:type="dxa"/>
+            </w:tcMar>
+          </w:tcPr>
+          <w:p>
+            <w:pPr>
+              <w:pStyle w:val="Normal"/>
+              <w:bidi w:val="0"/>
+              <w:jc w:val="start"/>
+              <w:rPr>
+                <w:rFonts w:ascii="Arial" w:hAnsi="Arial" w:eastAsia="Arial" w:cs="Arial"/>
+              </w:rPr>
+            </w:pPr>
+            <w:r>
+              <w:rPr>
+                <w:rFonts w:eastAsia="Arial" w:cs="Arial"/>
+              </w:rPr>
+              <w:t>Valider `name` dans validate_recipe_json() → 422 propre au lieu de 500</w:t>
+            </w:r>
+          </w:p>
+        </w:tc>
+      </w:tr>
+      <w:tr>
+        <w:trPr/>
+        <w:tc>
+          <w:tcPr>
+            <w:tcW w:w="4199" w:type="dxa"/>
+            <w:tcBorders>
+              <w:top w:val="single" w:sz="2" w:space="0" w:color="CCCCCC"/>
+              <w:start w:val="single" w:sz="2" w:space="0" w:color="CCCCCC"/>
+              <w:bottom w:val="single" w:sz="2" w:space="0" w:color="CCCCCC"/>
+              <w:end w:val="single" w:sz="2" w:space="0" w:color="CCCCCC"/>
+            </w:tcBorders>
+            <w:shd w:fill="FFFFFF" w:val="clear"/>
+            <w:tcMar>
+              <w:top w:w="70" w:type="dxa"/>
+              <w:bottom w:w="70" w:type="dxa"/>
+            </w:tcMar>
+          </w:tcPr>
+          <w:p>
+            <w:pPr>
+              <w:pStyle w:val="Normal"/>
+              <w:bidi w:val="0"/>
+              <w:jc w:val="start"/>
+              <w:rPr>
+                <w:rFonts w:ascii="Arial" w:hAnsi="Arial" w:eastAsia="Arial" w:cs="Arial"/>
+              </w:rPr>
+            </w:pPr>
+            <w:r>
+              <w:rPr>
+                <w:rFonts w:eastAsia="Arial" w:cs="Arial"/>
+              </w:rPr>
+              <w:t>✅ Pas d’avertissement avant de quitter AdminRecipeEdit en cours d’édition</w:t>
+            </w:r>
+          </w:p>
+        </w:tc>
+        <w:tc>
+          <w:tcPr>
+            <w:tcW w:w="1800" w:type="dxa"/>
+            <w:tcBorders>
+              <w:top w:val="single" w:sz="2" w:space="0" w:color="CCCCCC"/>
+              <w:start w:val="single" w:sz="2" w:space="0" w:color="CCCCCC"/>
+              <w:bottom w:val="single" w:sz="2" w:space="0" w:color="CCCCCC"/>
+              <w:end w:val="single" w:sz="2" w:space="0" w:color="CCCCCC"/>
+            </w:tcBorders>
+            <w:shd w:fill="FFFFFF" w:val="clear"/>
+            <w:tcMar>
+              <w:top w:w="70" w:type="dxa"/>
+              <w:bottom w:w="70" w:type="dxa"/>
+            </w:tcMar>
+          </w:tcPr>
+          <w:p>
+            <w:pPr>
+              <w:pStyle w:val="Normal"/>
+              <w:bidi w:val="0"/>
+              <w:jc w:val="start"/>
+              <w:rPr>
+                <w:rFonts w:ascii="Arial" w:hAnsi="Arial" w:eastAsia="Arial" w:cs="Arial"/>
+              </w:rPr>
+            </w:pPr>
+            <w:r>
+              <w:rPr>
+                <w:rFonts w:eastAsia="Arial" w:cs="Arial"/>
+              </w:rPr>
+              <w:t>Faible</w:t>
+            </w:r>
+          </w:p>
+        </w:tc>
+        <w:tc>
+          <w:tcPr>
+            <w:tcW w:w="3361" w:type="dxa"/>
+            <w:tcBorders>
+              <w:top w:val="single" w:sz="2" w:space="0" w:color="CCCCCC"/>
+              <w:start w:val="single" w:sz="2" w:space="0" w:color="CCCCCC"/>
+              <w:bottom w:val="single" w:sz="2" w:space="0" w:color="CCCCCC"/>
+              <w:end w:val="single" w:sz="2" w:space="0" w:color="CCCCCC"/>
+            </w:tcBorders>
+            <w:shd w:fill="FFFFFF" w:val="clear"/>
+            <w:tcMar>
+              <w:top w:w="70" w:type="dxa"/>
+              <w:bottom w:w="70" w:type="dxa"/>
+            </w:tcMar>
+          </w:tcPr>
+          <w:p>
+            <w:pPr>
+              <w:pStyle w:val="Normal"/>
+              <w:bidi w:val="0"/>
+              <w:jc w:val="start"/>
+              <w:rPr>
+                <w:rFonts w:ascii="Arial" w:hAnsi="Arial" w:eastAsia="Arial" w:cs="Arial"/>
+              </w:rPr>
+            </w:pPr>
+            <w:r>
+              <w:rPr>
+                <w:rFonts w:eastAsia="Arial" w:cs="Arial"/>
+              </w:rPr>
+              <w:t>État `isDirty` + confirm() sur le bouton ← et beforeunload</w:t>
+            </w:r>
+          </w:p>
+        </w:tc>
+      </w:tr>
+    </w:tbl>
+    <w:p>
+      <w:pPr>
+        <w:pStyle w:val="Normal"/>
+        <w:bidi w:val="0"/>
+        <w:spacing w:before="200" w:after="0"/>
+        <w:jc w:val="start"/>
+        <w:rPr/>
+      </w:pPr>
+      <w:r>
+        <w:rPr/>
+      </w:r>
+    </w:p>
+    <w:p>
+      <w:pPr>
+        <w:pStyle w:val="Heading3"/>
+        <w:bidi w:val="0"/>
+        <w:spacing w:before="280" w:after="100"/>
+        <w:jc w:val="start"/>
+        <w:rPr>
+          <w:rFonts w:ascii="Arial" w:hAnsi="Arial" w:eastAsia="Arial" w:cs="Arial"/>
+          <w:b/>
+          <w:bCs/>
+          <w:color w:val="374151"/>
+          <w:sz w:val="24"/>
+          <w:szCs w:val="24"/>
+        </w:rPr>
+      </w:pPr>
+      <w:r>
+        <w:rPr>
+          <w:rFonts w:eastAsia="Arial" w:cs="Arial" w:ascii="Arial" w:hAnsi="Arial"/>
+          <w:b/>
+          <w:bCs/>
+          <w:color w:val="374151"/>
+          <w:sz w:val="24"/>
+          <w:szCs w:val="24"/>
+        </w:rPr>
+        <w:t>🟡 AUDIT — Robustesse &amp; UX (Priorité moyenne)</w:t>
+      </w:r>
+    </w:p>
+    <w:tbl>
+      <w:tblPr>
+        <w:tblW w:w="9360" w:type="dxa"/>
+        <w:jc w:val="start"/>
+        <w:tblInd w:w="0" w:type="dxa"/>
+        <w:tblLayout w:type="fixed"/>
+        <w:tblCellMar>
+          <w:top w:w="80" w:type="dxa"/>
+          <w:start w:w="120" w:type="dxa"/>
+          <w:bottom w:w="80" w:type="dxa"/>
+          <w:end w:w="120" w:type="dxa"/>
+        </w:tblCellMar>
+      </w:tblPr>
+      <w:tblGrid>
+        <w:gridCol w:w="4199"/>
+        <w:gridCol w:w="1800"/>
+        <w:gridCol w:w="3361"/>
+      </w:tblGrid>
+      <w:tr>
+        <w:trPr>
+          <w:tblHeader w:val="true"/>
+        </w:trPr>
+        <w:tc>
+          <w:tcPr>
+            <w:tcW w:w="4199" w:type="dxa"/>
+            <w:tcBorders>
+              <w:top w:val="single" w:sz="2" w:space="0" w:color="CCCCCC"/>
+              <w:start w:val="single" w:sz="2" w:space="0" w:color="CCCCCC"/>
+              <w:bottom w:val="single" w:sz="2" w:space="0" w:color="CCCCCC"/>
+              <w:end w:val="single" w:sz="2" w:space="0" w:color="CCCCCC"/>
+            </w:tcBorders>
+            <w:shd w:fill="1F2937" w:val="clear"/>
+          </w:tcPr>
+          <w:p>
+            <w:pPr>
+              <w:pStyle w:val="Normal"/>
+              <w:bidi w:val="0"/>
+              <w:jc w:val="start"/>
+              <w:rPr>
+                <w:rFonts w:ascii="Arial" w:hAnsi="Arial" w:eastAsia="Arial" w:cs="Arial"/>
+                <w:b/>
+                <w:bCs/>
+                <w:color w:val="FFFFFF"/>
+                <w:sz w:val="20"/>
+                <w:szCs w:val="20"/>
+              </w:rPr>
+            </w:pPr>
+            <w:r>
+              <w:rPr>
+                <w:rFonts w:eastAsia="Arial" w:cs="Arial"/>
+                <w:b/>
+                <w:bCs/>
+                <w:color w:val="FFFFFF"/>
+                <w:sz w:val="20"/>
+                <w:szCs w:val="20"/>
+              </w:rPr>
+              <w:t>Fonctionnalité</w:t>
+            </w:r>
+          </w:p>
+        </w:tc>
+        <w:tc>
+          <w:tcPr>
+            <w:tcW w:w="1800" w:type="dxa"/>
+            <w:tcBorders>
+              <w:top w:val="single" w:sz="2" w:space="0" w:color="CCCCCC"/>
+              <w:start w:val="single" w:sz="2" w:space="0" w:color="CCCCCC"/>
+              <w:bottom w:val="single" w:sz="2" w:space="0" w:color="CCCCCC"/>
+              <w:end w:val="single" w:sz="2" w:space="0" w:color="CCCCCC"/>
+            </w:tcBorders>
+            <w:shd w:fill="1F2937" w:val="clear"/>
+          </w:tcPr>
+          <w:p>
+            <w:pPr>
+              <w:pStyle w:val="Normal"/>
+              <w:bidi w:val="0"/>
+              <w:jc w:val="start"/>
+              <w:rPr>
+                <w:rFonts w:ascii="Arial" w:hAnsi="Arial" w:eastAsia="Arial" w:cs="Arial"/>
+                <w:b/>
+                <w:bCs/>
+                <w:color w:val="FFFFFF"/>
+                <w:sz w:val="20"/>
+                <w:szCs w:val="20"/>
+              </w:rPr>
+            </w:pPr>
+            <w:r>
+              <w:rPr>
+                <w:rFonts w:eastAsia="Arial" w:cs="Arial"/>
+                <w:b/>
+                <w:bCs/>
+                <w:color w:val="FFFFFF"/>
+                <w:sz w:val="20"/>
+                <w:szCs w:val="20"/>
+              </w:rPr>
+              <w:t>Effort</w:t>
+            </w:r>
+          </w:p>
+        </w:tc>
+        <w:tc>
+          <w:tcPr>
+            <w:tcW w:w="3361" w:type="dxa"/>
+            <w:tcBorders>
+              <w:top w:val="single" w:sz="2" w:space="0" w:color="CCCCCC"/>
+              <w:start w:val="single" w:sz="2" w:space="0" w:color="CCCCCC"/>
+              <w:bottom w:val="single" w:sz="2" w:space="0" w:color="CCCCCC"/>
+              <w:end w:val="single" w:sz="2" w:space="0" w:color="CCCCCC"/>
+            </w:tcBorders>
+            <w:shd w:fill="1F2937" w:val="clear"/>
+          </w:tcPr>
+          <w:p>
+            <w:pPr>
+              <w:pStyle w:val="Normal"/>
+              <w:bidi w:val="0"/>
+              <w:jc w:val="start"/>
+              <w:rPr>
+                <w:rFonts w:ascii="Arial" w:hAnsi="Arial" w:eastAsia="Arial" w:cs="Arial"/>
+                <w:b/>
+                <w:bCs/>
+                <w:color w:val="FFFFFF"/>
+                <w:sz w:val="20"/>
+                <w:szCs w:val="20"/>
+              </w:rPr>
+            </w:pPr>
+            <w:r>
+              <w:rPr>
+                <w:rFonts w:eastAsia="Arial" w:cs="Arial"/>
+                <w:b/>
+                <w:bCs/>
+                <w:color w:val="FFFFFF"/>
+                <w:sz w:val="20"/>
+                <w:szCs w:val="20"/>
+              </w:rPr>
+              <w:t>Détail</w:t>
+            </w:r>
+          </w:p>
+        </w:tc>
+      </w:tr>
+      <w:tr>
+        <w:trPr/>
+        <w:tc>
+          <w:tcPr>
+            <w:tcW w:w="4199" w:type="dxa"/>
+            <w:tcBorders>
+              <w:top w:val="single" w:sz="2" w:space="0" w:color="CCCCCC"/>
+              <w:start w:val="single" w:sz="2" w:space="0" w:color="CCCCCC"/>
+              <w:bottom w:val="single" w:sz="2" w:space="0" w:color="CCCCCC"/>
+              <w:end w:val="single" w:sz="2" w:space="0" w:color="CCCCCC"/>
+            </w:tcBorders>
+            <w:shd w:fill="FFFFFF" w:val="clear"/>
+            <w:tcMar>
+              <w:top w:w="70" w:type="dxa"/>
+              <w:bottom w:w="70" w:type="dxa"/>
+            </w:tcMar>
+          </w:tcPr>
+          <w:p>
+            <w:pPr>
+              <w:pStyle w:val="Normal"/>
+              <w:bidi w:val="0"/>
+              <w:jc w:val="start"/>
+              <w:rPr>
+                <w:rFonts w:ascii="Arial" w:hAnsi="Arial" w:eastAsia="Arial" w:cs="Arial"/>
+              </w:rPr>
+            </w:pPr>
+            <w:r>
+              <w:rPr>
+                <w:rFonts w:eastAsia="Arial" w:cs="Arial"/>
+              </w:rPr>
+              <w:t>✅ handleAddItem : double-submit via Enter rapide</w:t>
+            </w:r>
+          </w:p>
+        </w:tc>
+        <w:tc>
+          <w:tcPr>
+            <w:tcW w:w="1800" w:type="dxa"/>
+            <w:tcBorders>
+              <w:top w:val="single" w:sz="2" w:space="0" w:color="CCCCCC"/>
+              <w:start w:val="single" w:sz="2" w:space="0" w:color="CCCCCC"/>
+              <w:bottom w:val="single" w:sz="2" w:space="0" w:color="CCCCCC"/>
+              <w:end w:val="single" w:sz="2" w:space="0" w:color="CCCCCC"/>
+            </w:tcBorders>
+            <w:shd w:fill="FFFFFF" w:val="clear"/>
+            <w:tcMar>
+              <w:top w:w="70" w:type="dxa"/>
+              <w:bottom w:w="70" w:type="dxa"/>
+            </w:tcMar>
+          </w:tcPr>
+          <w:p>
+            <w:pPr>
+              <w:pStyle w:val="Normal"/>
+              <w:bidi w:val="0"/>
+              <w:jc w:val="start"/>
+              <w:rPr>
+                <w:rFonts w:ascii="Arial" w:hAnsi="Arial" w:eastAsia="Arial" w:cs="Arial"/>
+              </w:rPr>
+            </w:pPr>
+            <w:r>
+              <w:rPr>
+                <w:rFonts w:eastAsia="Arial" w:cs="Arial"/>
+              </w:rPr>
+              <w:t>Faible</w:t>
+            </w:r>
+          </w:p>
+        </w:tc>
+        <w:tc>
+          <w:tcPr>
+            <w:tcW w:w="3361" w:type="dxa"/>
+            <w:tcBorders>
+              <w:top w:val="single" w:sz="2" w:space="0" w:color="CCCCCC"/>
+              <w:start w:val="single" w:sz="2" w:space="0" w:color="CCCCCC"/>
+              <w:bottom w:val="single" w:sz="2" w:space="0" w:color="CCCCCC"/>
+              <w:end w:val="single" w:sz="2" w:space="0" w:color="CCCCCC"/>
+            </w:tcBorders>
+            <w:shd w:fill="FFFFFF" w:val="clear"/>
+            <w:tcMar>
+              <w:top w:w="70" w:type="dxa"/>
+              <w:bottom w:w="70" w:type="dxa"/>
+            </w:tcMar>
+          </w:tcPr>
+          <w:p>
+            <w:pPr>
+              <w:pStyle w:val="Normal"/>
+              <w:bidi w:val="0"/>
+              <w:jc w:val="start"/>
+              <w:rPr>
+                <w:rFonts w:ascii="Arial" w:hAnsi="Arial" w:eastAsia="Arial" w:cs="Arial"/>
+              </w:rPr>
+            </w:pPr>
+            <w:r>
+              <w:rPr>
+                <w:rFonts w:eastAsia="Arial" w:cs="Arial"/>
+              </w:rPr>
+              <w:t>Ajouter `if (addingItem) return` en tête de handleAddItem dans ShoppingList.jsx</w:t>
+            </w:r>
+          </w:p>
+        </w:tc>
+      </w:tr>
+      <w:tr>
+        <w:trPr/>
+        <w:tc>
+          <w:tcPr>
+            <w:tcW w:w="4199" w:type="dxa"/>
+            <w:tcBorders>
+              <w:top w:val="single" w:sz="2" w:space="0" w:color="CCCCCC"/>
+              <w:start w:val="single" w:sz="2" w:space="0" w:color="CCCCCC"/>
+              <w:bottom w:val="single" w:sz="2" w:space="0" w:color="CCCCCC"/>
+              <w:end w:val="single" w:sz="2" w:space="0" w:color="CCCCCC"/>
+            </w:tcBorders>
+            <w:shd w:fill="F9FAFB" w:val="clear"/>
+            <w:tcMar>
+              <w:top w:w="70" w:type="dxa"/>
+              <w:bottom w:w="70" w:type="dxa"/>
+            </w:tcMar>
+          </w:tcPr>
+          <w:p>
+            <w:pPr>
+              <w:pStyle w:val="Normal"/>
+              <w:bidi w:val="0"/>
+              <w:jc w:val="start"/>
+              <w:rPr>
+                <w:rFonts w:ascii="Arial" w:hAnsi="Arial" w:eastAsia="Arial" w:cs="Arial"/>
+              </w:rPr>
+            </w:pPr>
+            <w:r>
+              <w:rPr>
+                <w:rFonts w:eastAsia="Arial" w:cs="Arial"/>
+              </w:rPr>
+              <w:t>✅ weekly_goal = 0 → Infinity% dans Stats</w:t>
+            </w:r>
+          </w:p>
+        </w:tc>
+        <w:tc>
+          <w:tcPr>
+            <w:tcW w:w="1800" w:type="dxa"/>
+            <w:tcBorders>
+              <w:top w:val="single" w:sz="2" w:space="0" w:color="CCCCCC"/>
+              <w:start w:val="single" w:sz="2" w:space="0" w:color="CCCCCC"/>
+              <w:bottom w:val="single" w:sz="2" w:space="0" w:color="CCCCCC"/>
+              <w:end w:val="single" w:sz="2" w:space="0" w:color="CCCCCC"/>
+            </w:tcBorders>
+            <w:shd w:fill="F9FAFB" w:val="clear"/>
+            <w:tcMar>
+              <w:top w:w="70" w:type="dxa"/>
+              <w:bottom w:w="70" w:type="dxa"/>
+            </w:tcMar>
+          </w:tcPr>
+          <w:p>
+            <w:pPr>
+              <w:pStyle w:val="Normal"/>
+              <w:bidi w:val="0"/>
+              <w:jc w:val="start"/>
+              <w:rPr>
+                <w:rFonts w:ascii="Arial" w:hAnsi="Arial" w:eastAsia="Arial" w:cs="Arial"/>
+              </w:rPr>
+            </w:pPr>
+            <w:r>
+              <w:rPr>
+                <w:rFonts w:eastAsia="Arial" w:cs="Arial"/>
+              </w:rPr>
+              <w:t>Faible</w:t>
+            </w:r>
+          </w:p>
+        </w:tc>
+        <w:tc>
+          <w:tcPr>
+            <w:tcW w:w="3361" w:type="dxa"/>
+            <w:tcBorders>
+              <w:top w:val="single" w:sz="2" w:space="0" w:color="CCCCCC"/>
+              <w:start w:val="single" w:sz="2" w:space="0" w:color="CCCCCC"/>
+              <w:bottom w:val="single" w:sz="2" w:space="0" w:color="CCCCCC"/>
+              <w:end w:val="single" w:sz="2" w:space="0" w:color="CCCCCC"/>
+            </w:tcBorders>
+            <w:shd w:fill="F9FAFB" w:val="clear"/>
+            <w:tcMar>
+              <w:top w:w="70" w:type="dxa"/>
+              <w:bottom w:w="70" w:type="dxa"/>
+            </w:tcMar>
+          </w:tcPr>
+          <w:p>
+            <w:pPr>
+              <w:pStyle w:val="Normal"/>
+              <w:bidi w:val="0"/>
+              <w:jc w:val="start"/>
+              <w:rPr>
+                <w:rFonts w:ascii="Arial" w:hAnsi="Arial" w:eastAsia="Arial" w:cs="Arial"/>
+              </w:rPr>
+            </w:pPr>
+            <w:r>
+              <w:rPr>
+                <w:rFonts w:eastAsia="Arial" w:cs="Arial"/>
+              </w:rPr>
+              <w:t>`ge=1` sur SettingsUpdate.weekly_goal Pydantic + guard NaN/Infinity côté frontend</w:t>
+            </w:r>
+          </w:p>
+        </w:tc>
+      </w:tr>
+      <w:tr>
+        <w:trPr/>
+        <w:tc>
+          <w:tcPr>
+            <w:tcW w:w="4199" w:type="dxa"/>
+            <w:tcBorders>
+              <w:top w:val="single" w:sz="2" w:space="0" w:color="CCCCCC"/>
+              <w:start w:val="single" w:sz="2" w:space="0" w:color="CCCCCC"/>
+              <w:bottom w:val="single" w:sz="2" w:space="0" w:color="CCCCCC"/>
+              <w:end w:val="single" w:sz="2" w:space="0" w:color="CCCCCC"/>
+            </w:tcBorders>
+            <w:shd w:fill="FFFFFF" w:val="clear"/>
+            <w:tcMar>
+              <w:top w:w="70" w:type="dxa"/>
+              <w:bottom w:w="70" w:type="dxa"/>
+            </w:tcMar>
+          </w:tcPr>
+          <w:p>
+            <w:pPr>
+              <w:pStyle w:val="Normal"/>
+              <w:bidi w:val="0"/>
+              <w:jc w:val="start"/>
+              <w:rPr>
+                <w:rFonts w:ascii="Arial" w:hAnsi="Arial" w:eastAsia="Arial" w:cs="Arial"/>
+              </w:rPr>
+            </w:pPr>
+            <w:r>
+              <w:rPr>
+                <w:rFonts w:eastAsia="Arial" w:cs="Arial"/>
+              </w:rPr>
+              <w:t>✅ navigator.clipboard silencieux en HTTP (NAS)</w:t>
+            </w:r>
+          </w:p>
+        </w:tc>
+        <w:tc>
+          <w:tcPr>
+            <w:tcW w:w="1800" w:type="dxa"/>
+            <w:tcBorders>
+              <w:top w:val="single" w:sz="2" w:space="0" w:color="CCCCCC"/>
+              <w:start w:val="single" w:sz="2" w:space="0" w:color="CCCCCC"/>
+              <w:bottom w:val="single" w:sz="2" w:space="0" w:color="CCCCCC"/>
+              <w:end w:val="single" w:sz="2" w:space="0" w:color="CCCCCC"/>
+            </w:tcBorders>
+            <w:shd w:fill="FFFFFF" w:val="clear"/>
+            <w:tcMar>
+              <w:top w:w="70" w:type="dxa"/>
+              <w:bottom w:w="70" w:type="dxa"/>
+            </w:tcMar>
+          </w:tcPr>
+          <w:p>
+            <w:pPr>
+              <w:pStyle w:val="Normal"/>
+              <w:bidi w:val="0"/>
+              <w:jc w:val="start"/>
+              <w:rPr>
+                <w:rFonts w:ascii="Arial" w:hAnsi="Arial" w:eastAsia="Arial" w:cs="Arial"/>
+              </w:rPr>
+            </w:pPr>
+            <w:r>
+              <w:rPr>
+                <w:rFonts w:eastAsia="Arial" w:cs="Arial"/>
+              </w:rPr>
+              <w:t>Faible</w:t>
+            </w:r>
+          </w:p>
+        </w:tc>
+        <w:tc>
+          <w:tcPr>
+            <w:tcW w:w="3361" w:type="dxa"/>
+            <w:tcBorders>
+              <w:top w:val="single" w:sz="2" w:space="0" w:color="CCCCCC"/>
+              <w:start w:val="single" w:sz="2" w:space="0" w:color="CCCCCC"/>
+              <w:bottom w:val="single" w:sz="2" w:space="0" w:color="CCCCCC"/>
+              <w:end w:val="single" w:sz="2" w:space="0" w:color="CCCCCC"/>
+            </w:tcBorders>
+            <w:shd w:fill="FFFFFF" w:val="clear"/>
+            <w:tcMar>
+              <w:top w:w="70" w:type="dxa"/>
+              <w:bottom w:w="70" w:type="dxa"/>
+            </w:tcMar>
+          </w:tcPr>
+          <w:p>
+            <w:pPr>
+              <w:pStyle w:val="Normal"/>
+              <w:bidi w:val="0"/>
+              <w:jc w:val="start"/>
+              <w:rPr>
+                <w:rFonts w:ascii="Arial" w:hAnsi="Arial" w:eastAsia="Arial" w:cs="Arial"/>
+              </w:rPr>
+            </w:pPr>
+            <w:r>
+              <w:rPr>
+                <w:rFonts w:eastAsia="Arial" w:cs="Arial"/>
+              </w:rPr>
+              <w:t>Ajouter `.catch(() =&gt; alert("Copie non disponible en HTTP"))` dans copyToClipboard</w:t>
+            </w:r>
+          </w:p>
+        </w:tc>
+      </w:tr>
+      <w:tr>
+        <w:trPr/>
+        <w:tc>
+          <w:tcPr>
+            <w:tcW w:w="4199" w:type="dxa"/>
+            <w:tcBorders>
+              <w:top w:val="single" w:sz="2" w:space="0" w:color="CCCCCC"/>
+              <w:start w:val="single" w:sz="2" w:space="0" w:color="CCCCCC"/>
+              <w:bottom w:val="single" w:sz="2" w:space="0" w:color="CCCCCC"/>
+              <w:end w:val="single" w:sz="2" w:space="0" w:color="CCCCCC"/>
+            </w:tcBorders>
+            <w:shd w:fill="F9FAFB" w:val="clear"/>
+            <w:tcMar>
+              <w:top w:w="70" w:type="dxa"/>
+              <w:bottom w:w="70" w:type="dxa"/>
+            </w:tcMar>
+          </w:tcPr>
+          <w:p>
+            <w:pPr>
+              <w:pStyle w:val="Normal"/>
+              <w:bidi w:val="0"/>
+              <w:jc w:val="start"/>
+              <w:rPr>
+                <w:rFonts w:ascii="Arial" w:hAnsi="Arial" w:eastAsia="Arial" w:cs="Arial"/>
+              </w:rPr>
+            </w:pPr>
+            <w:r>
+              <w:rPr>
+                <w:rFonts w:eastAsia="Arial" w:cs="Arial"/>
+              </w:rPr>
+              <w:t>✅ completeShoppingList sans catch → erreur silencieuse</w:t>
+            </w:r>
+          </w:p>
+        </w:tc>
+        <w:tc>
+          <w:tcPr>
+            <w:tcW w:w="1800" w:type="dxa"/>
+            <w:tcBorders>
+              <w:top w:val="single" w:sz="2" w:space="0" w:color="CCCCCC"/>
+              <w:start w:val="single" w:sz="2" w:space="0" w:color="CCCCCC"/>
+              <w:bottom w:val="single" w:sz="2" w:space="0" w:color="CCCCCC"/>
+              <w:end w:val="single" w:sz="2" w:space="0" w:color="CCCCCC"/>
+            </w:tcBorders>
+            <w:shd w:fill="F9FAFB" w:val="clear"/>
+            <w:tcMar>
+              <w:top w:w="70" w:type="dxa"/>
+              <w:bottom w:w="70" w:type="dxa"/>
+            </w:tcMar>
+          </w:tcPr>
+          <w:p>
+            <w:pPr>
+              <w:pStyle w:val="Normal"/>
+              <w:bidi w:val="0"/>
+              <w:jc w:val="start"/>
+              <w:rPr>
+                <w:rFonts w:ascii="Arial" w:hAnsi="Arial" w:eastAsia="Arial" w:cs="Arial"/>
+              </w:rPr>
+            </w:pPr>
+            <w:r>
+              <w:rPr>
+                <w:rFonts w:eastAsia="Arial" w:cs="Arial"/>
+              </w:rPr>
+              <w:t>Faible</w:t>
+            </w:r>
+          </w:p>
+        </w:tc>
+        <w:tc>
+          <w:tcPr>
+            <w:tcW w:w="3361" w:type="dxa"/>
+            <w:tcBorders>
+              <w:top w:val="single" w:sz="2" w:space="0" w:color="CCCCCC"/>
+              <w:start w:val="single" w:sz="2" w:space="0" w:color="CCCCCC"/>
+              <w:bottom w:val="single" w:sz="2" w:space="0" w:color="CCCCCC"/>
+              <w:end w:val="single" w:sz="2" w:space="0" w:color="CCCCCC"/>
+            </w:tcBorders>
+            <w:shd w:fill="F9FAFB" w:val="clear"/>
+            <w:tcMar>
+              <w:top w:w="70" w:type="dxa"/>
+              <w:bottom w:w="70" w:type="dxa"/>
+            </w:tcMar>
+          </w:tcPr>
+          <w:p>
+            <w:pPr>
+              <w:pStyle w:val="Normal"/>
+              <w:bidi w:val="0"/>
+              <w:jc w:val="start"/>
+              <w:rPr>
+                <w:rFonts w:ascii="Arial" w:hAnsi="Arial" w:eastAsia="Arial" w:cs="Arial"/>
+              </w:rPr>
+            </w:pPr>
+            <w:r>
+              <w:rPr>
+                <w:rFonts w:eastAsia="Arial" w:cs="Arial"/>
+              </w:rPr>
+              <w:t>Wrapper try/catch + message d'erreur utilisateur dans handleComplete</w:t>
+            </w:r>
+          </w:p>
+        </w:tc>
+      </w:tr>
+      <w:tr>
+        <w:trPr/>
+        <w:tc>
+          <w:tcPr>
+            <w:tcW w:w="4199" w:type="dxa"/>
+            <w:tcBorders>
+              <w:top w:val="single" w:sz="2" w:space="0" w:color="CCCCCC"/>
+              <w:start w:val="single" w:sz="2" w:space="0" w:color="CCCCCC"/>
+              <w:bottom w:val="single" w:sz="2" w:space="0" w:color="CCCCCC"/>
+              <w:end w:val="single" w:sz="2" w:space="0" w:color="CCCCCC"/>
+            </w:tcBorders>
+            <w:shd w:fill="FFFFFF" w:val="clear"/>
+            <w:tcMar>
+              <w:top w:w="70" w:type="dxa"/>
+              <w:bottom w:w="70" w:type="dxa"/>
+            </w:tcMar>
+          </w:tcPr>
+          <w:p>
+            <w:pPr>
+              <w:pStyle w:val="Normal"/>
+              <w:bidi w:val="0"/>
+              <w:jc w:val="start"/>
+              <w:rPr>
+                <w:rFonts w:ascii="Arial" w:hAnsi="Arial" w:eastAsia="Arial" w:cs="Arial"/>
+              </w:rPr>
+            </w:pPr>
+            <w:r>
+              <w:rPr>
+                <w:rFonts w:eastAsia="Arial" w:cs="Arial"/>
+              </w:rPr>
+              <w:t>✅ FocusMode double-tap "Terminé !" → 2 sessions cooking_history</w:t>
+            </w:r>
+          </w:p>
+        </w:tc>
+        <w:tc>
+          <w:tcPr>
+            <w:tcW w:w="1800" w:type="dxa"/>
+            <w:tcBorders>
+              <w:top w:val="single" w:sz="2" w:space="0" w:color="CCCCCC"/>
+              <w:start w:val="single" w:sz="2" w:space="0" w:color="CCCCCC"/>
+              <w:bottom w:val="single" w:sz="2" w:space="0" w:color="CCCCCC"/>
+              <w:end w:val="single" w:sz="2" w:space="0" w:color="CCCCCC"/>
+            </w:tcBorders>
+            <w:shd w:fill="FFFFFF" w:val="clear"/>
+            <w:tcMar>
+              <w:top w:w="70" w:type="dxa"/>
+              <w:bottom w:w="70" w:type="dxa"/>
+            </w:tcMar>
+          </w:tcPr>
+          <w:p>
+            <w:pPr>
+              <w:pStyle w:val="Normal"/>
+              <w:bidi w:val="0"/>
+              <w:jc w:val="start"/>
+              <w:rPr>
+                <w:rFonts w:ascii="Arial" w:hAnsi="Arial" w:eastAsia="Arial" w:cs="Arial"/>
+              </w:rPr>
+            </w:pPr>
+            <w:r>
+              <w:rPr>
+                <w:rFonts w:eastAsia="Arial" w:cs="Arial"/>
+              </w:rPr>
+              <w:t>Faible</w:t>
+            </w:r>
+          </w:p>
+        </w:tc>
+        <w:tc>
+          <w:tcPr>
+            <w:tcW w:w="3361" w:type="dxa"/>
+            <w:tcBorders>
+              <w:top w:val="single" w:sz="2" w:space="0" w:color="CCCCCC"/>
+              <w:start w:val="single" w:sz="2" w:space="0" w:color="CCCCCC"/>
+              <w:bottom w:val="single" w:sz="2" w:space="0" w:color="CCCCCC"/>
+              <w:end w:val="single" w:sz="2" w:space="0" w:color="CCCCCC"/>
+            </w:tcBorders>
+            <w:shd w:fill="FFFFFF" w:val="clear"/>
+            <w:tcMar>
+              <w:top w:w="70" w:type="dxa"/>
+              <w:bottom w:w="70" w:type="dxa"/>
+            </w:tcMar>
+          </w:tcPr>
+          <w:p>
+            <w:pPr>
+              <w:pStyle w:val="Normal"/>
+              <w:bidi w:val="0"/>
+              <w:jc w:val="start"/>
+              <w:rPr>
+                <w:rFonts w:ascii="Arial" w:hAnsi="Arial" w:eastAsia="Arial" w:cs="Arial"/>
+              </w:rPr>
+            </w:pPr>
+            <w:r>
+              <w:rPr>
+                <w:rFonts w:eastAsia="Arial" w:cs="Arial"/>
+              </w:rPr>
+              <w:t>Ref `completing` à true avant await logCook() pour bloquer re-entrée</w:t>
+            </w:r>
+          </w:p>
+        </w:tc>
+      </w:tr>
+      <w:tr>
+        <w:trPr/>
+        <w:tc>
+          <w:tcPr>
+            <w:tcW w:w="4199" w:type="dxa"/>
+            <w:tcBorders>
+              <w:top w:val="single" w:sz="2" w:space="0" w:color="CCCCCC"/>
+              <w:start w:val="single" w:sz="2" w:space="0" w:color="CCCCCC"/>
+              <w:bottom w:val="single" w:sz="2" w:space="0" w:color="CCCCCC"/>
+              <w:end w:val="single" w:sz="2" w:space="0" w:color="CCCCCC"/>
+            </w:tcBorders>
+            <w:shd w:fill="F9FAFB" w:val="clear"/>
+            <w:tcMar>
+              <w:top w:w="70" w:type="dxa"/>
+              <w:bottom w:w="70" w:type="dxa"/>
+            </w:tcMar>
+          </w:tcPr>
+          <w:p>
+            <w:pPr>
+              <w:pStyle w:val="Normal"/>
+              <w:bidi w:val="0"/>
+              <w:jc w:val="start"/>
+              <w:rPr>
+                <w:rFonts w:ascii="Arial" w:hAnsi="Arial" w:eastAsia="Arial" w:cs="Arial"/>
+              </w:rPr>
+            </w:pPr>
+            <w:r>
+              <w:rPr>
+                <w:rFonts w:eastAsia="Arial" w:cs="Arial"/>
+              </w:rPr>
+              <w:t>✅ Pas de .catch() sur fetches critiques (FocusMode, Recipes, Stats)</w:t>
+            </w:r>
+          </w:p>
+        </w:tc>
+        <w:tc>
+          <w:tcPr>
+            <w:tcW w:w="1800" w:type="dxa"/>
+            <w:tcBorders>
+              <w:top w:val="single" w:sz="2" w:space="0" w:color="CCCCCC"/>
+              <w:start w:val="single" w:sz="2" w:space="0" w:color="CCCCCC"/>
+              <w:bottom w:val="single" w:sz="2" w:space="0" w:color="CCCCCC"/>
+              <w:end w:val="single" w:sz="2" w:space="0" w:color="CCCCCC"/>
+            </w:tcBorders>
+            <w:shd w:fill="F9FAFB" w:val="clear"/>
+            <w:tcMar>
+              <w:top w:w="70" w:type="dxa"/>
+              <w:bottom w:w="70" w:type="dxa"/>
+            </w:tcMar>
+          </w:tcPr>
+          <w:p>
+            <w:pPr>
+              <w:pStyle w:val="Normal"/>
+              <w:bidi w:val="0"/>
+              <w:jc w:val="start"/>
+              <w:rPr>
+                <w:rFonts w:ascii="Arial" w:hAnsi="Arial" w:eastAsia="Arial" w:cs="Arial"/>
+              </w:rPr>
+            </w:pPr>
+            <w:r>
+              <w:rPr>
+                <w:rFonts w:eastAsia="Arial" w:cs="Arial"/>
+              </w:rPr>
+              <w:t>Faible</w:t>
+            </w:r>
+          </w:p>
+        </w:tc>
+        <w:tc>
+          <w:tcPr>
+            <w:tcW w:w="3361" w:type="dxa"/>
+            <w:tcBorders>
+              <w:top w:val="single" w:sz="2" w:space="0" w:color="CCCCCC"/>
+              <w:start w:val="single" w:sz="2" w:space="0" w:color="CCCCCC"/>
+              <w:bottom w:val="single" w:sz="2" w:space="0" w:color="CCCCCC"/>
+              <w:end w:val="single" w:sz="2" w:space="0" w:color="CCCCCC"/>
+            </w:tcBorders>
+            <w:shd w:fill="F9FAFB" w:val="clear"/>
+            <w:tcMar>
+              <w:top w:w="70" w:type="dxa"/>
+              <w:bottom w:w="70" w:type="dxa"/>
+            </w:tcMar>
+          </w:tcPr>
+          <w:p>
+            <w:pPr>
+              <w:pStyle w:val="Normal"/>
+              <w:bidi w:val="0"/>
+              <w:jc w:val="start"/>
+              <w:rPr>
+                <w:rFonts w:ascii="Arial" w:hAnsi="Arial" w:eastAsia="Arial" w:cs="Arial"/>
+              </w:rPr>
+            </w:pPr>
+            <w:r>
+              <w:rPr>
+                <w:rFonts w:eastAsia="Arial" w:cs="Arial"/>
+              </w:rPr>
+              <w:t>Ajouter `.catch()` avec état d'erreur dans FocusMode.jsx, Recipes.jsx, Stats.jsx</w:t>
+            </w:r>
+          </w:p>
+        </w:tc>
+      </w:tr>
+      <w:tr>
+        <w:trPr/>
+        <w:tc>
+          <w:tcPr>
+            <w:tcW w:w="4199" w:type="dxa"/>
+            <w:tcBorders>
+              <w:top w:val="single" w:sz="2" w:space="0" w:color="CCCCCC"/>
+              <w:start w:val="single" w:sz="2" w:space="0" w:color="CCCCCC"/>
+              <w:bottom w:val="single" w:sz="2" w:space="0" w:color="CCCCCC"/>
+              <w:end w:val="single" w:sz="2" w:space="0" w:color="CCCCCC"/>
+            </w:tcBorders>
+            <w:shd w:fill="FFFFFF" w:val="clear"/>
+            <w:tcMar>
+              <w:top w:w="70" w:type="dxa"/>
+              <w:bottom w:w="70" w:type="dxa"/>
+            </w:tcMar>
+          </w:tcPr>
+          <w:p>
+            <w:pPr>
+              <w:pStyle w:val="Normal"/>
+              <w:bidi w:val="0"/>
+              <w:jc w:val="start"/>
+              <w:rPr>
+                <w:rFonts w:ascii="Arial" w:hAnsi="Arial" w:eastAsia="Arial" w:cs="Arial"/>
+              </w:rPr>
+            </w:pPr>
+            <w:r>
+              <w:rPr>
+                <w:rFonts w:eastAsia="Arial" w:cs="Arial"/>
+              </w:rPr>
+              <w:t>✅ FocusMode : quantités non scalées dans StepCard</w:t>
+            </w:r>
+          </w:p>
+        </w:tc>
+        <w:tc>
+          <w:tcPr>
+            <w:tcW w:w="1800" w:type="dxa"/>
+            <w:tcBorders>
+              <w:top w:val="single" w:sz="2" w:space="0" w:color="CCCCCC"/>
+              <w:start w:val="single" w:sz="2" w:space="0" w:color="CCCCCC"/>
+              <w:bottom w:val="single" w:sz="2" w:space="0" w:color="CCCCCC"/>
+              <w:end w:val="single" w:sz="2" w:space="0" w:color="CCCCCC"/>
+            </w:tcBorders>
+            <w:shd w:fill="FFFFFF" w:val="clear"/>
+            <w:tcMar>
+              <w:top w:w="70" w:type="dxa"/>
+              <w:bottom w:w="70" w:type="dxa"/>
+            </w:tcMar>
+          </w:tcPr>
+          <w:p>
+            <w:pPr>
+              <w:pStyle w:val="Normal"/>
+              <w:bidi w:val="0"/>
+              <w:jc w:val="start"/>
+              <w:rPr>
+                <w:rFonts w:ascii="Arial" w:hAnsi="Arial" w:eastAsia="Arial" w:cs="Arial"/>
+              </w:rPr>
+            </w:pPr>
+            <w:r>
+              <w:rPr>
+                <w:rFonts w:eastAsia="Arial" w:cs="Arial"/>
+              </w:rPr>
+              <w:t>Faible</w:t>
+            </w:r>
+          </w:p>
+        </w:tc>
+        <w:tc>
+          <w:tcPr>
+            <w:tcW w:w="3361" w:type="dxa"/>
+            <w:tcBorders>
+              <w:top w:val="single" w:sz="2" w:space="0" w:color="CCCCCC"/>
+              <w:start w:val="single" w:sz="2" w:space="0" w:color="CCCCCC"/>
+              <w:bottom w:val="single" w:sz="2" w:space="0" w:color="CCCCCC"/>
+              <w:end w:val="single" w:sz="2" w:space="0" w:color="CCCCCC"/>
+            </w:tcBorders>
+            <w:shd w:fill="FFFFFF" w:val="clear"/>
+            <w:tcMar>
+              <w:top w:w="70" w:type="dxa"/>
+              <w:bottom w:w="70" w:type="dxa"/>
+            </w:tcMar>
+          </w:tcPr>
+          <w:p>
+            <w:pPr>
+              <w:pStyle w:val="Normal"/>
+              <w:bidi w:val="0"/>
+              <w:jc w:val="start"/>
+              <w:rPr>
+                <w:rFonts w:ascii="Arial" w:hAnsi="Arial" w:eastAsia="Arial" w:cs="Arial"/>
+              </w:rPr>
+            </w:pPr>
+            <w:r>
+              <w:rPr>
+                <w:rFonts w:eastAsia="Arial" w:cs="Arial"/>
+              </w:rPr>
+              <w:t>Passer `scale` en prop à StepCard et appliquer aux quantités des ingrédients d'étape</w:t>
+            </w:r>
+          </w:p>
+        </w:tc>
+      </w:tr>
+      <w:tr>
+        <w:trPr/>
+        <w:tc>
+          <w:tcPr>
+            <w:tcW w:w="4199" w:type="dxa"/>
+            <w:tcBorders>
+              <w:top w:val="single" w:sz="2" w:space="0" w:color="CCCCCC"/>
+              <w:start w:val="single" w:sz="2" w:space="0" w:color="CCCCCC"/>
+              <w:bottom w:val="single" w:sz="2" w:space="0" w:color="CCCCCC"/>
+              <w:end w:val="single" w:sz="2" w:space="0" w:color="CCCCCC"/>
+            </w:tcBorders>
+            <w:shd w:fill="F9FAFB" w:val="clear"/>
+            <w:tcMar>
+              <w:top w:w="70" w:type="dxa"/>
+              <w:bottom w:w="70" w:type="dxa"/>
+            </w:tcMar>
+          </w:tcPr>
+          <w:p>
+            <w:pPr>
+              <w:pStyle w:val="Normal"/>
+              <w:bidi w:val="0"/>
+              <w:jc w:val="start"/>
+              <w:rPr>
+                <w:rFonts w:ascii="Arial" w:hAnsi="Arial" w:eastAsia="Arial" w:cs="Arial"/>
+              </w:rPr>
+            </w:pPr>
+            <w:r>
+              <w:rPr>
+                <w:rFonts w:eastAsia="Arial" w:cs="Arial"/>
+              </w:rPr>
+              <w:t>✅ Terminer une liste vide sans confirmation</w:t>
+            </w:r>
+          </w:p>
+        </w:tc>
+        <w:tc>
+          <w:tcPr>
+            <w:tcW w:w="1800" w:type="dxa"/>
+            <w:tcBorders>
+              <w:top w:val="single" w:sz="2" w:space="0" w:color="CCCCCC"/>
+              <w:start w:val="single" w:sz="2" w:space="0" w:color="CCCCCC"/>
+              <w:bottom w:val="single" w:sz="2" w:space="0" w:color="CCCCCC"/>
+              <w:end w:val="single" w:sz="2" w:space="0" w:color="CCCCCC"/>
+            </w:tcBorders>
+            <w:shd w:fill="F9FAFB" w:val="clear"/>
+            <w:tcMar>
+              <w:top w:w="70" w:type="dxa"/>
+              <w:bottom w:w="70" w:type="dxa"/>
+            </w:tcMar>
+          </w:tcPr>
+          <w:p>
+            <w:pPr>
+              <w:pStyle w:val="Normal"/>
+              <w:bidi w:val="0"/>
+              <w:jc w:val="start"/>
+              <w:rPr>
+                <w:rFonts w:ascii="Arial" w:hAnsi="Arial" w:eastAsia="Arial" w:cs="Arial"/>
+              </w:rPr>
+            </w:pPr>
+            <w:r>
+              <w:rPr>
+                <w:rFonts w:eastAsia="Arial" w:cs="Arial"/>
+              </w:rPr>
+              <w:t>Faible</w:t>
+            </w:r>
+          </w:p>
+        </w:tc>
+        <w:tc>
+          <w:tcPr>
+            <w:tcW w:w="3361" w:type="dxa"/>
+            <w:tcBorders>
+              <w:top w:val="single" w:sz="2" w:space="0" w:color="CCCCCC"/>
+              <w:start w:val="single" w:sz="2" w:space="0" w:color="CCCCCC"/>
+              <w:bottom w:val="single" w:sz="2" w:space="0" w:color="CCCCCC"/>
+              <w:end w:val="single" w:sz="2" w:space="0" w:color="CCCCCC"/>
+            </w:tcBorders>
+            <w:shd w:fill="F9FAFB" w:val="clear"/>
+            <w:tcMar>
+              <w:top w:w="70" w:type="dxa"/>
+              <w:bottom w:w="70" w:type="dxa"/>
+            </w:tcMar>
+          </w:tcPr>
+          <w:p>
+            <w:pPr>
+              <w:pStyle w:val="Normal"/>
+              <w:bidi w:val="0"/>
+              <w:jc w:val="start"/>
+              <w:rPr>
+                <w:rFonts w:ascii="Arial" w:hAnsi="Arial" w:eastAsia="Arial" w:cs="Arial"/>
+              </w:rPr>
+            </w:pPr>
+            <w:r>
+              <w:rPr>
+                <w:rFonts w:eastAsia="Arial" w:cs="Arial"/>
+              </w:rPr>
+              <w:t>Ajouter garde si items.length === 0 dans handleComplete ou désactiver le bouton</w:t>
+            </w:r>
+          </w:p>
+        </w:tc>
+      </w:tr>
+    </w:tbl>
+    <w:p>
+      <w:pPr>
+        <w:pStyle w:val="Normal"/>
+        <w:bidi w:val="0"/>
+        <w:spacing w:before="200" w:after="0"/>
+        <w:jc w:val="start"/>
+        <w:rPr/>
+      </w:pPr>
+      <w:r>
+        <w:rPr/>
+      </w:r>
+    </w:p>
+    <w:p>
+      <w:pPr>
+        <w:pStyle w:val="Heading3"/>
+        <w:bidi w:val="0"/>
+        <w:spacing w:before="280" w:after="100"/>
+        <w:jc w:val="start"/>
+        <w:rPr>
+          <w:rFonts w:ascii="Arial" w:hAnsi="Arial" w:eastAsia="Arial" w:cs="Arial"/>
+          <w:b/>
+          <w:bCs/>
+          <w:color w:val="374151"/>
+          <w:sz w:val="24"/>
+          <w:szCs w:val="24"/>
+        </w:rPr>
+      </w:pPr>
+      <w:r>
+        <w:rPr>
+          <w:rFonts w:eastAsia="Arial" w:cs="Arial" w:ascii="Arial" w:hAnsi="Arial"/>
+          <w:b/>
+          <w:bCs/>
+          <w:color w:val="374151"/>
+          <w:sz w:val="24"/>
+          <w:szCs w:val="24"/>
+        </w:rPr>
+        <w:t>🟢 AUDIT — Améliorations techniques (Priorité basse)</w:t>
+      </w:r>
+    </w:p>
+    <w:tbl>
+      <w:tblPr>
+        <w:tblW w:w="9360" w:type="dxa"/>
+        <w:jc w:val="start"/>
+        <w:tblInd w:w="0" w:type="dxa"/>
+        <w:tblLayout w:type="fixed"/>
+        <w:tblCellMar>
+          <w:top w:w="80" w:type="dxa"/>
+          <w:start w:w="120" w:type="dxa"/>
+          <w:bottom w:w="80" w:type="dxa"/>
+          <w:end w:w="120" w:type="dxa"/>
+        </w:tblCellMar>
+      </w:tblPr>
+      <w:tblGrid>
+        <w:gridCol w:w="4199"/>
+        <w:gridCol w:w="1800"/>
+        <w:gridCol w:w="3361"/>
+      </w:tblGrid>
+      <w:tr>
+        <w:trPr>
+          <w:tblHeader w:val="true"/>
+        </w:trPr>
+        <w:tc>
+          <w:tcPr>
+            <w:tcW w:w="4199" w:type="dxa"/>
+            <w:tcBorders>
+              <w:top w:val="single" w:sz="2" w:space="0" w:color="CCCCCC"/>
+              <w:start w:val="single" w:sz="2" w:space="0" w:color="CCCCCC"/>
+              <w:bottom w:val="single" w:sz="2" w:space="0" w:color="CCCCCC"/>
+              <w:end w:val="single" w:sz="2" w:space="0" w:color="CCCCCC"/>
+            </w:tcBorders>
+            <w:shd w:fill="1F2937" w:val="clear"/>
+          </w:tcPr>
+          <w:p>
+            <w:pPr>
+              <w:pStyle w:val="Normal"/>
+              <w:bidi w:val="0"/>
+              <w:jc w:val="start"/>
+              <w:rPr>
+                <w:rFonts w:ascii="Arial" w:hAnsi="Arial" w:eastAsia="Arial" w:cs="Arial"/>
+                <w:b/>
+                <w:bCs/>
+                <w:color w:val="FFFFFF"/>
+                <w:sz w:val="20"/>
+                <w:szCs w:val="20"/>
+              </w:rPr>
+            </w:pPr>
+            <w:r>
+              <w:rPr>
+                <w:rFonts w:eastAsia="Arial" w:cs="Arial"/>
+                <w:b/>
+                <w:bCs/>
+                <w:color w:val="FFFFFF"/>
+                <w:sz w:val="20"/>
+                <w:szCs w:val="20"/>
+              </w:rPr>
+              <w:t>Fonctionnalité</w:t>
+            </w:r>
+          </w:p>
+        </w:tc>
+        <w:tc>
+          <w:tcPr>
+            <w:tcW w:w="1800" w:type="dxa"/>
+            <w:tcBorders>
+              <w:top w:val="single" w:sz="2" w:space="0" w:color="CCCCCC"/>
+              <w:start w:val="single" w:sz="2" w:space="0" w:color="CCCCCC"/>
+              <w:bottom w:val="single" w:sz="2" w:space="0" w:color="CCCCCC"/>
+              <w:end w:val="single" w:sz="2" w:space="0" w:color="CCCCCC"/>
+            </w:tcBorders>
+            <w:shd w:fill="1F2937" w:val="clear"/>
+          </w:tcPr>
+          <w:p>
+            <w:pPr>
+              <w:pStyle w:val="Normal"/>
+              <w:bidi w:val="0"/>
+              <w:jc w:val="start"/>
+              <w:rPr>
+                <w:rFonts w:ascii="Arial" w:hAnsi="Arial" w:eastAsia="Arial" w:cs="Arial"/>
+                <w:b/>
+                <w:bCs/>
+                <w:color w:val="FFFFFF"/>
+                <w:sz w:val="20"/>
+                <w:szCs w:val="20"/>
+              </w:rPr>
+            </w:pPr>
+            <w:r>
+              <w:rPr>
+                <w:rFonts w:eastAsia="Arial" w:cs="Arial"/>
+                <w:b/>
+                <w:bCs/>
+                <w:color w:val="FFFFFF"/>
+                <w:sz w:val="20"/>
+                <w:szCs w:val="20"/>
+              </w:rPr>
+              <w:t>Effort</w:t>
+            </w:r>
+          </w:p>
+        </w:tc>
+        <w:tc>
+          <w:tcPr>
+            <w:tcW w:w="3361" w:type="dxa"/>
+            <w:tcBorders>
+              <w:top w:val="single" w:sz="2" w:space="0" w:color="CCCCCC"/>
+              <w:start w:val="single" w:sz="2" w:space="0" w:color="CCCCCC"/>
+              <w:bottom w:val="single" w:sz="2" w:space="0" w:color="CCCCCC"/>
+              <w:end w:val="single" w:sz="2" w:space="0" w:color="CCCCCC"/>
+            </w:tcBorders>
+            <w:shd w:fill="1F2937" w:val="clear"/>
+          </w:tcPr>
+          <w:p>
+            <w:pPr>
+              <w:pStyle w:val="Normal"/>
+              <w:bidi w:val="0"/>
+              <w:jc w:val="start"/>
+              <w:rPr>
+                <w:rFonts w:ascii="Arial" w:hAnsi="Arial" w:eastAsia="Arial" w:cs="Arial"/>
+                <w:b/>
+                <w:bCs/>
+                <w:color w:val="FFFFFF"/>
+                <w:sz w:val="20"/>
+                <w:szCs w:val="20"/>
+              </w:rPr>
+            </w:pPr>
+            <w:r>
+              <w:rPr>
+                <w:rFonts w:eastAsia="Arial" w:cs="Arial"/>
+                <w:b/>
+                <w:bCs/>
+                <w:color w:val="FFFFFF"/>
+                <w:sz w:val="20"/>
+                <w:szCs w:val="20"/>
+              </w:rPr>
+              <w:t>Détail</w:t>
+            </w:r>
+          </w:p>
+        </w:tc>
+      </w:tr>
+      <w:tr>
+        <w:trPr/>
+        <w:tc>
+          <w:tcPr>
+            <w:tcW w:w="4199" w:type="dxa"/>
+            <w:tcBorders>
+              <w:top w:val="single" w:sz="2" w:space="0" w:color="CCCCCC"/>
+              <w:start w:val="single" w:sz="2" w:space="0" w:color="CCCCCC"/>
+              <w:bottom w:val="single" w:sz="2" w:space="0" w:color="CCCCCC"/>
+              <w:end w:val="single" w:sz="2" w:space="0" w:color="CCCCCC"/>
+            </w:tcBorders>
+            <w:shd w:fill="FFFFFF" w:val="clear"/>
+            <w:tcMar>
+              <w:top w:w="70" w:type="dxa"/>
+              <w:bottom w:w="70" w:type="dxa"/>
+            </w:tcMar>
+          </w:tcPr>
+          <w:p>
+            <w:pPr>
+              <w:pStyle w:val="Normal"/>
+              <w:bidi w:val="0"/>
+              <w:jc w:val="start"/>
+              <w:rPr>
+                <w:rFonts w:ascii="Arial" w:hAnsi="Arial" w:eastAsia="Arial" w:cs="Arial"/>
+              </w:rPr>
+            </w:pPr>
+            <w:r>
+              <w:rPr>
+                <w:rFonts w:eastAsia="Arial" w:cs="Arial"/>
+              </w:rPr>
+              <w:t>✅ ErrorBoundary React globale</w:t>
+            </w:r>
+          </w:p>
+        </w:tc>
+        <w:tc>
+          <w:tcPr>
+            <w:tcW w:w="1800" w:type="dxa"/>
+            <w:tcBorders>
+              <w:top w:val="single" w:sz="2" w:space="0" w:color="CCCCCC"/>
+              <w:start w:val="single" w:sz="2" w:space="0" w:color="CCCCCC"/>
+              <w:bottom w:val="single" w:sz="2" w:space="0" w:color="CCCCCC"/>
+              <w:end w:val="single" w:sz="2" w:space="0" w:color="CCCCCC"/>
+            </w:tcBorders>
+            <w:shd w:fill="FFFFFF" w:val="clear"/>
+            <w:tcMar>
+              <w:top w:w="70" w:type="dxa"/>
+              <w:bottom w:w="70" w:type="dxa"/>
+            </w:tcMar>
+          </w:tcPr>
+          <w:p>
+            <w:pPr>
+              <w:pStyle w:val="Normal"/>
+              <w:bidi w:val="0"/>
+              <w:jc w:val="start"/>
+              <w:rPr>
+                <w:rFonts w:ascii="Arial" w:hAnsi="Arial" w:eastAsia="Arial" w:cs="Arial"/>
+              </w:rPr>
+            </w:pPr>
+            <w:r>
+              <w:rPr>
+                <w:rFonts w:eastAsia="Arial" w:cs="Arial"/>
+              </w:rPr>
+              <w:t>Faible</w:t>
+            </w:r>
+          </w:p>
+        </w:tc>
+        <w:tc>
+          <w:tcPr>
+            <w:tcW w:w="3361" w:type="dxa"/>
+            <w:tcBorders>
+              <w:top w:val="single" w:sz="2" w:space="0" w:color="CCCCCC"/>
+              <w:start w:val="single" w:sz="2" w:space="0" w:color="CCCCCC"/>
+              <w:bottom w:val="single" w:sz="2" w:space="0" w:color="CCCCCC"/>
+              <w:end w:val="single" w:sz="2" w:space="0" w:color="CCCCCC"/>
+            </w:tcBorders>
+            <w:shd w:fill="FFFFFF" w:val="clear"/>
+            <w:tcMar>
+              <w:top w:w="70" w:type="dxa"/>
+              <w:bottom w:w="70" w:type="dxa"/>
+            </w:tcMar>
+          </w:tcPr>
+          <w:p>
+            <w:pPr>
+              <w:pStyle w:val="Normal"/>
+              <w:bidi w:val="0"/>
+              <w:jc w:val="start"/>
+              <w:rPr>
+                <w:rFonts w:ascii="Arial" w:hAnsi="Arial" w:eastAsia="Arial" w:cs="Arial"/>
+              </w:rPr>
+            </w:pPr>
+            <w:r>
+              <w:rPr>
+                <w:rFonts w:eastAsia="Arial" w:cs="Arial"/>
+              </w:rPr>
+              <w:t>Wrapper top-level dans App.jsx : crash de render → message + bouton "Actualiser" au lieu d'écran blanc</w:t>
+            </w:r>
+          </w:p>
+        </w:tc>
+      </w:tr>
+      <w:tr>
+        <w:trPr/>
+        <w:tc>
+          <w:tcPr>
+            <w:tcW w:w="4199" w:type="dxa"/>
+            <w:tcBorders>
+              <w:top w:val="single" w:sz="2" w:space="0" w:color="CCCCCC"/>
+              <w:start w:val="single" w:sz="2" w:space="0" w:color="CCCCCC"/>
+              <w:bottom w:val="single" w:sz="2" w:space="0" w:color="CCCCCC"/>
+              <w:end w:val="single" w:sz="2" w:space="0" w:color="CCCCCC"/>
+            </w:tcBorders>
+            <w:shd w:fill="F9FAFB" w:val="clear"/>
+            <w:tcMar>
+              <w:top w:w="70" w:type="dxa"/>
+              <w:bottom w:w="70" w:type="dxa"/>
+            </w:tcMar>
+          </w:tcPr>
+          <w:p>
+            <w:pPr>
+              <w:pStyle w:val="Normal"/>
+              <w:bidi w:val="0"/>
+              <w:jc w:val="start"/>
+              <w:rPr>
+                <w:rFonts w:ascii="Arial" w:hAnsi="Arial" w:eastAsia="Arial" w:cs="Arial"/>
+              </w:rPr>
+            </w:pPr>
+            <w:r>
+              <w:rPr>
+                <w:rFonts w:eastAsia="Arial" w:cs="Arial"/>
+              </w:rPr>
+              <w:t>✅ Export toutes recettes : N requêtes parallèles</w:t>
+            </w:r>
+          </w:p>
+        </w:tc>
+        <w:tc>
+          <w:tcPr>
+            <w:tcW w:w="1800" w:type="dxa"/>
+            <w:tcBorders>
+              <w:top w:val="single" w:sz="2" w:space="0" w:color="CCCCCC"/>
+              <w:start w:val="single" w:sz="2" w:space="0" w:color="CCCCCC"/>
+              <w:bottom w:val="single" w:sz="2" w:space="0" w:color="CCCCCC"/>
+              <w:end w:val="single" w:sz="2" w:space="0" w:color="CCCCCC"/>
+            </w:tcBorders>
+            <w:shd w:fill="F9FAFB" w:val="clear"/>
+            <w:tcMar>
+              <w:top w:w="70" w:type="dxa"/>
+              <w:bottom w:w="70" w:type="dxa"/>
+            </w:tcMar>
+          </w:tcPr>
+          <w:p>
+            <w:pPr>
+              <w:pStyle w:val="Normal"/>
+              <w:bidi w:val="0"/>
+              <w:jc w:val="start"/>
+              <w:rPr>
+                <w:rFonts w:ascii="Arial" w:hAnsi="Arial" w:eastAsia="Arial" w:cs="Arial"/>
+              </w:rPr>
+            </w:pPr>
+            <w:r>
+              <w:rPr>
+                <w:rFonts w:eastAsia="Arial" w:cs="Arial"/>
+              </w:rPr>
+              <w:t>Moyen</w:t>
+            </w:r>
+          </w:p>
+        </w:tc>
+        <w:tc>
+          <w:tcPr>
+            <w:tcW w:w="3361" w:type="dxa"/>
+            <w:tcBorders>
+              <w:top w:val="single" w:sz="2" w:space="0" w:color="CCCCCC"/>
+              <w:start w:val="single" w:sz="2" w:space="0" w:color="CCCCCC"/>
+              <w:bottom w:val="single" w:sz="2" w:space="0" w:color="CCCCCC"/>
+              <w:end w:val="single" w:sz="2" w:space="0" w:color="CCCCCC"/>
+            </w:tcBorders>
+            <w:shd w:fill="F9FAFB" w:val="clear"/>
+            <w:tcMar>
+              <w:top w:w="70" w:type="dxa"/>
+              <w:bottom w:w="70" w:type="dxa"/>
+            </w:tcMar>
+          </w:tcPr>
+          <w:p>
+            <w:pPr>
+              <w:pStyle w:val="Normal"/>
+              <w:bidi w:val="0"/>
+              <w:jc w:val="start"/>
+              <w:rPr>
+                <w:rFonts w:ascii="Arial" w:hAnsi="Arial" w:eastAsia="Arial" w:cs="Arial"/>
+              </w:rPr>
+            </w:pPr>
+            <w:r>
+              <w:rPr>
+                <w:rFonts w:eastAsia="Arial" w:cs="Arial"/>
+              </w:rPr>
+              <w:t>Créer endpoint /api/recipes/export/all côté backend au lieu de N Promise.all côté frontend</w:t>
+            </w:r>
+          </w:p>
+        </w:tc>
+      </w:tr>
+      <w:tr>
+        <w:trPr/>
+        <w:tc>
+          <w:tcPr>
+            <w:tcW w:w="4199" w:type="dxa"/>
+            <w:tcBorders>
+              <w:top w:val="single" w:sz="2" w:space="0" w:color="CCCCCC"/>
+              <w:start w:val="single" w:sz="2" w:space="0" w:color="CCCCCC"/>
+              <w:bottom w:val="single" w:sz="2" w:space="0" w:color="CCCCCC"/>
+              <w:end w:val="single" w:sz="2" w:space="0" w:color="CCCCCC"/>
+            </w:tcBorders>
+            <w:shd w:fill="FFFFFF" w:val="clear"/>
+            <w:tcMar>
+              <w:top w:w="70" w:type="dxa"/>
+              <w:bottom w:w="70" w:type="dxa"/>
+            </w:tcMar>
+          </w:tcPr>
+          <w:p>
+            <w:pPr>
+              <w:pStyle w:val="Normal"/>
+              <w:bidi w:val="0"/>
+              <w:jc w:val="start"/>
+              <w:rPr>
+                <w:rFonts w:ascii="Arial" w:hAnsi="Arial" w:eastAsia="Arial" w:cs="Arial"/>
+              </w:rPr>
+            </w:pPr>
+            <w:r>
+              <w:rPr>
+                <w:rFonts w:eastAsia="Arial" w:cs="Arial"/>
+              </w:rPr>
+              <w:t>✅ SQLite : WAL mode + connexion partagée</w:t>
+            </w:r>
+          </w:p>
+        </w:tc>
+        <w:tc>
+          <w:tcPr>
+            <w:tcW w:w="1800" w:type="dxa"/>
+            <w:tcBorders>
+              <w:top w:val="single" w:sz="2" w:space="0" w:color="CCCCCC"/>
+              <w:start w:val="single" w:sz="2" w:space="0" w:color="CCCCCC"/>
+              <w:bottom w:val="single" w:sz="2" w:space="0" w:color="CCCCCC"/>
+              <w:end w:val="single" w:sz="2" w:space="0" w:color="CCCCCC"/>
+            </w:tcBorders>
+            <w:shd w:fill="FFFFFF" w:val="clear"/>
+            <w:tcMar>
+              <w:top w:w="70" w:type="dxa"/>
+              <w:bottom w:w="70" w:type="dxa"/>
+            </w:tcMar>
+          </w:tcPr>
+          <w:p>
+            <w:pPr>
+              <w:pStyle w:val="Normal"/>
+              <w:bidi w:val="0"/>
+              <w:jc w:val="start"/>
+              <w:rPr>
+                <w:rFonts w:ascii="Arial" w:hAnsi="Arial" w:eastAsia="Arial" w:cs="Arial"/>
+              </w:rPr>
+            </w:pPr>
+            <w:r>
+              <w:rPr>
+                <w:rFonts w:eastAsia="Arial" w:cs="Arial"/>
+              </w:rPr>
+              <w:t>Faible</w:t>
+            </w:r>
+          </w:p>
+        </w:tc>
+        <w:tc>
+          <w:tcPr>
+            <w:tcW w:w="3361" w:type="dxa"/>
+            <w:tcBorders>
+              <w:top w:val="single" w:sz="2" w:space="0" w:color="CCCCCC"/>
+              <w:start w:val="single" w:sz="2" w:space="0" w:color="CCCCCC"/>
+              <w:bottom w:val="single" w:sz="2" w:space="0" w:color="CCCCCC"/>
+              <w:end w:val="single" w:sz="2" w:space="0" w:color="CCCCCC"/>
+            </w:tcBorders>
+            <w:shd w:fill="FFFFFF" w:val="clear"/>
+            <w:tcMar>
+              <w:top w:w="70" w:type="dxa"/>
+              <w:bottom w:w="70" w:type="dxa"/>
+            </w:tcMar>
+          </w:tcPr>
+          <w:p>
+            <w:pPr>
+              <w:pStyle w:val="Normal"/>
+              <w:bidi w:val="0"/>
+              <w:jc w:val="start"/>
+              <w:rPr>
+                <w:rFonts w:ascii="Arial" w:hAnsi="Arial" w:eastAsia="Arial" w:cs="Arial"/>
+              </w:rPr>
+            </w:pPr>
+            <w:r>
+              <w:rPr>
+                <w:rFonts w:eastAsia="Arial" w:cs="Arial"/>
+              </w:rPr>
+              <w:t>PRAGMA journal_mode=WAL au démarrage + module-level connection avec threading.Lock</w:t>
+            </w:r>
+          </w:p>
+        </w:tc>
+      </w:tr>
+      <w:tr>
+        <w:trPr/>
+        <w:tc>
+          <w:tcPr>
+            <w:tcW w:w="4199" w:type="dxa"/>
+            <w:tcBorders>
+              <w:top w:val="single" w:sz="2" w:space="0" w:color="CCCCCC"/>
+              <w:start w:val="single" w:sz="2" w:space="0" w:color="CCCCCC"/>
+              <w:bottom w:val="single" w:sz="2" w:space="0" w:color="CCCCCC"/>
+              <w:end w:val="single" w:sz="2" w:space="0" w:color="CCCCCC"/>
+            </w:tcBorders>
+            <w:shd w:fill="F9FAFB" w:val="clear"/>
+            <w:tcMar>
+              <w:top w:w="70" w:type="dxa"/>
+              <w:bottom w:w="70" w:type="dxa"/>
+            </w:tcMar>
+          </w:tcPr>
+          <w:p>
+            <w:pPr>
+              <w:pStyle w:val="Normal"/>
+              <w:bidi w:val="0"/>
+              <w:jc w:val="start"/>
+              <w:rPr>
+                <w:rFonts w:ascii="Arial" w:hAnsi="Arial" w:eastAsia="Arial" w:cs="Arial"/>
+              </w:rPr>
+            </w:pPr>
+            <w:r>
+              <w:rPr>
+                <w:rFonts w:eastAsia="Arial" w:cs="Arial"/>
+              </w:rPr>
+              <w:t>✅ GET /api/history sans plafond de résultats</w:t>
+            </w:r>
+          </w:p>
+        </w:tc>
+        <w:tc>
+          <w:tcPr>
+            <w:tcW w:w="1800" w:type="dxa"/>
+            <w:tcBorders>
+              <w:top w:val="single" w:sz="2" w:space="0" w:color="CCCCCC"/>
+              <w:start w:val="single" w:sz="2" w:space="0" w:color="CCCCCC"/>
+              <w:bottom w:val="single" w:sz="2" w:space="0" w:color="CCCCCC"/>
+              <w:end w:val="single" w:sz="2" w:space="0" w:color="CCCCCC"/>
+            </w:tcBorders>
+            <w:shd w:fill="F9FAFB" w:val="clear"/>
+            <w:tcMar>
+              <w:top w:w="70" w:type="dxa"/>
+              <w:bottom w:w="70" w:type="dxa"/>
+            </w:tcMar>
+          </w:tcPr>
+          <w:p>
+            <w:pPr>
+              <w:pStyle w:val="Normal"/>
+              <w:bidi w:val="0"/>
+              <w:jc w:val="start"/>
+              <w:rPr>
+                <w:rFonts w:ascii="Arial" w:hAnsi="Arial" w:eastAsia="Arial" w:cs="Arial"/>
+              </w:rPr>
+            </w:pPr>
+            <w:r>
+              <w:rPr>
+                <w:rFonts w:eastAsia="Arial" w:cs="Arial"/>
+              </w:rPr>
+              <w:t>Faible</w:t>
+            </w:r>
+          </w:p>
+        </w:tc>
+        <w:tc>
+          <w:tcPr>
+            <w:tcW w:w="3361" w:type="dxa"/>
+            <w:tcBorders>
+              <w:top w:val="single" w:sz="2" w:space="0" w:color="CCCCCC"/>
+              <w:start w:val="single" w:sz="2" w:space="0" w:color="CCCCCC"/>
+              <w:bottom w:val="single" w:sz="2" w:space="0" w:color="CCCCCC"/>
+              <w:end w:val="single" w:sz="2" w:space="0" w:color="CCCCCC"/>
+            </w:tcBorders>
+            <w:shd w:fill="F9FAFB" w:val="clear"/>
+            <w:tcMar>
+              <w:top w:w="70" w:type="dxa"/>
+              <w:bottom w:w="70" w:type="dxa"/>
+            </w:tcMar>
+          </w:tcPr>
+          <w:p>
+            <w:pPr>
+              <w:pStyle w:val="Normal"/>
+              <w:bidi w:val="0"/>
+              <w:jc w:val="start"/>
+              <w:rPr>
+                <w:rFonts w:ascii="Arial" w:hAnsi="Arial" w:eastAsia="Arial" w:cs="Arial"/>
+              </w:rPr>
+            </w:pPr>
+            <w:r>
+              <w:rPr>
+                <w:rFonts w:eastAsia="Arial" w:cs="Arial"/>
+              </w:rPr>
+              <w:t>Ajouter `le=500` sur le Query parameter `limit` dans main.py</w:t>
+            </w:r>
+          </w:p>
+        </w:tc>
+      </w:tr>
+      <w:tr>
+        <w:trPr/>
+        <w:tc>
+          <w:tcPr>
+            <w:tcW w:w="4199" w:type="dxa"/>
+            <w:tcBorders>
+              <w:top w:val="single" w:sz="2" w:space="0" w:color="CCCCCC"/>
+              <w:start w:val="single" w:sz="2" w:space="0" w:color="CCCCCC"/>
+              <w:bottom w:val="single" w:sz="2" w:space="0" w:color="CCCCCC"/>
+              <w:end w:val="single" w:sz="2" w:space="0" w:color="CCCCCC"/>
+            </w:tcBorders>
+            <w:shd w:fill="FFFFFF" w:val="clear"/>
+            <w:tcMar>
+              <w:top w:w="70" w:type="dxa"/>
+              <w:bottom w:w="70" w:type="dxa"/>
+            </w:tcMar>
+          </w:tcPr>
+          <w:p>
+            <w:pPr>
+              <w:pStyle w:val="Normal"/>
+              <w:bidi w:val="0"/>
+              <w:jc w:val="start"/>
+              <w:rPr>
+                <w:rFonts w:ascii="Arial" w:hAnsi="Arial" w:eastAsia="Arial" w:cs="Arial"/>
+              </w:rPr>
+            </w:pPr>
+            <w:r>
+              <w:rPr>
+                <w:rFonts w:eastAsia="Arial" w:cs="Arial"/>
+              </w:rPr>
+              <w:t>✅ column_exists() : interpolation directe du nom de table</w:t>
+            </w:r>
+          </w:p>
+        </w:tc>
+        <w:tc>
+          <w:tcPr>
+            <w:tcW w:w="1800" w:type="dxa"/>
+            <w:tcBorders>
+              <w:top w:val="single" w:sz="2" w:space="0" w:color="CCCCCC"/>
+              <w:start w:val="single" w:sz="2" w:space="0" w:color="CCCCCC"/>
+              <w:bottom w:val="single" w:sz="2" w:space="0" w:color="CCCCCC"/>
+              <w:end w:val="single" w:sz="2" w:space="0" w:color="CCCCCC"/>
+            </w:tcBorders>
+            <w:shd w:fill="FFFFFF" w:val="clear"/>
+            <w:tcMar>
+              <w:top w:w="70" w:type="dxa"/>
+              <w:bottom w:w="70" w:type="dxa"/>
+            </w:tcMar>
+          </w:tcPr>
+          <w:p>
+            <w:pPr>
+              <w:pStyle w:val="Normal"/>
+              <w:bidi w:val="0"/>
+              <w:jc w:val="start"/>
+              <w:rPr>
+                <w:rFonts w:ascii="Arial" w:hAnsi="Arial" w:eastAsia="Arial" w:cs="Arial"/>
+              </w:rPr>
+            </w:pPr>
+            <w:r>
+              <w:rPr>
+                <w:rFonts w:eastAsia="Arial" w:cs="Arial"/>
+              </w:rPr>
+              <w:t>Faible</w:t>
+            </w:r>
+          </w:p>
+        </w:tc>
+        <w:tc>
+          <w:tcPr>
+            <w:tcW w:w="3361" w:type="dxa"/>
+            <w:tcBorders>
+              <w:top w:val="single" w:sz="2" w:space="0" w:color="CCCCCC"/>
+              <w:start w:val="single" w:sz="2" w:space="0" w:color="CCCCCC"/>
+              <w:bottom w:val="single" w:sz="2" w:space="0" w:color="CCCCCC"/>
+              <w:end w:val="single" w:sz="2" w:space="0" w:color="CCCCCC"/>
+            </w:tcBorders>
+            <w:shd w:fill="FFFFFF" w:val="clear"/>
+            <w:tcMar>
+              <w:top w:w="70" w:type="dxa"/>
+              <w:bottom w:w="70" w:type="dxa"/>
+            </w:tcMar>
+          </w:tcPr>
+          <w:p>
+            <w:pPr>
+              <w:pStyle w:val="Normal"/>
+              <w:bidi w:val="0"/>
+              <w:jc w:val="start"/>
+              <w:rPr>
+                <w:rFonts w:ascii="Arial" w:hAnsi="Arial" w:eastAsia="Arial" w:cs="Arial"/>
+              </w:rPr>
+            </w:pPr>
+            <w:r>
+              <w:rPr>
+                <w:rFonts w:eastAsia="Arial" w:cs="Arial"/>
+              </w:rPr>
+              <w:t>Remplacer f-string par un whitelist check de noms de tables valides dans db.py</w:t>
+            </w:r>
+          </w:p>
+        </w:tc>
+      </w:tr>
+      <w:tr>
+        <w:trPr/>
+        <w:tc>
+          <w:tcPr>
+            <w:tcW w:w="4199" w:type="dxa"/>
+            <w:tcBorders>
+              <w:top w:val="single" w:sz="2" w:space="0" w:color="CCCCCC"/>
+              <w:start w:val="single" w:sz="2" w:space="0" w:color="CCCCCC"/>
+              <w:bottom w:val="single" w:sz="2" w:space="0" w:color="CCCCCC"/>
+              <w:end w:val="single" w:sz="2" w:space="0" w:color="CCCCCC"/>
+            </w:tcBorders>
+            <w:shd w:fill="F9FAFB" w:val="clear"/>
+            <w:tcMar>
+              <w:top w:w="70" w:type="dxa"/>
+              <w:bottom w:w="70" w:type="dxa"/>
+            </w:tcMar>
+          </w:tcPr>
+          <w:p>
+            <w:pPr>
+              <w:pStyle w:val="Normal"/>
+              <w:bidi w:val="0"/>
+              <w:jc w:val="start"/>
+              <w:rPr>
+                <w:rFonts w:ascii="Arial" w:hAnsi="Arial" w:eastAsia="Arial" w:cs="Arial"/>
+              </w:rPr>
+            </w:pPr>
+            <w:r>
+              <w:rPr>
+                <w:rFonts w:eastAsia="Arial" w:cs="Arial"/>
+              </w:rPr>
+              <w:t>✅ Step 3 "Retour" trompeur (liste déjà créée en DB)</w:t>
+            </w:r>
+          </w:p>
+        </w:tc>
+        <w:tc>
+          <w:tcPr>
+            <w:tcW w:w="1800" w:type="dxa"/>
+            <w:tcBorders>
+              <w:top w:val="single" w:sz="2" w:space="0" w:color="CCCCCC"/>
+              <w:start w:val="single" w:sz="2" w:space="0" w:color="CCCCCC"/>
+              <w:bottom w:val="single" w:sz="2" w:space="0" w:color="CCCCCC"/>
+              <w:end w:val="single" w:sz="2" w:space="0" w:color="CCCCCC"/>
+            </w:tcBorders>
+            <w:shd w:fill="F9FAFB" w:val="clear"/>
+            <w:tcMar>
+              <w:top w:w="70" w:type="dxa"/>
+              <w:bottom w:w="70" w:type="dxa"/>
+            </w:tcMar>
+          </w:tcPr>
+          <w:p>
+            <w:pPr>
+              <w:pStyle w:val="Normal"/>
+              <w:bidi w:val="0"/>
+              <w:jc w:val="start"/>
+              <w:rPr>
+                <w:rFonts w:ascii="Arial" w:hAnsi="Arial" w:eastAsia="Arial" w:cs="Arial"/>
+              </w:rPr>
+            </w:pPr>
+            <w:r>
+              <w:rPr>
+                <w:rFonts w:eastAsia="Arial" w:cs="Arial"/>
+              </w:rPr>
+              <w:t>Moyen</w:t>
+            </w:r>
+          </w:p>
+        </w:tc>
+        <w:tc>
+          <w:tcPr>
+            <w:tcW w:w="3361" w:type="dxa"/>
+            <w:tcBorders>
+              <w:top w:val="single" w:sz="2" w:space="0" w:color="CCCCCC"/>
+              <w:start w:val="single" w:sz="2" w:space="0" w:color="CCCCCC"/>
+              <w:bottom w:val="single" w:sz="2" w:space="0" w:color="CCCCCC"/>
+              <w:end w:val="single" w:sz="2" w:space="0" w:color="CCCCCC"/>
+            </w:tcBorders>
+            <w:shd w:fill="F9FAFB" w:val="clear"/>
+            <w:tcMar>
+              <w:top w:w="70" w:type="dxa"/>
+              <w:bottom w:w="70" w:type="dxa"/>
+            </w:tcMar>
+          </w:tcPr>
+          <w:p>
+            <w:pPr>
+              <w:pStyle w:val="Normal"/>
+              <w:bidi w:val="0"/>
+              <w:jc w:val="start"/>
+              <w:rPr>
+                <w:rFonts w:ascii="Arial" w:hAnsi="Arial" w:eastAsia="Arial" w:cs="Arial"/>
+              </w:rPr>
+            </w:pPr>
+            <w:r>
+              <w:rPr>
+                <w:rFonts w:eastAsia="Arial" w:cs="Arial"/>
+              </w:rPr>
+              <w:t>Ajouter note informative : "La liste est générée — Retour modifie uniquement les abandonnés"</w:t>
             </w:r>
           </w:p>
         </w:tc>
@@ -25340,13 +28078,7 @@
         <w:rPr>
           <w:rFonts w:eastAsia="Arial" w:cs="Arial"/>
         </w:rPr>
-        <w:t xml:space="preserve">— </w:t>
-      </w:r>
-      <w:r>
-        <w:rPr>
-          <w:rFonts w:eastAsia="Arial" w:cs="Arial"/>
-        </w:rPr>
-        <w:t>Fin de la bible projet AppCook v2.0 —</w:t>
+        <w:t>— Fin de la bible projet AppCook v2.0 —</w:t>
       </w:r>
     </w:p>
     <w:p>

</xml_diff>